<commit_message>
Fix manual page order: move v1.1 sections to correct positions
Sections 4.5-4.6 (Encryption Auditor, Trust Mapper) and 5.7-5.10
(GPP Passwords, Bronze Bit, Certifried, LDAP Signing) were appended
out of order. Moved them to their correct positions within sections
4 and 5 respectively. Regenerated PDF from fixed DOCX.

Co-Authored-By: Claude Opus 4.6 (1M context) <noreply@anthropic.com>
</commit_message>
<xml_diff>
--- a/kerb-map-manual.docx
+++ b/kerb-map-manual.docx
@@ -1,6 +1,6 @@
 
 <file path=word/document.xml><?xml version="1.0" encoding="utf-8"?>
-<w:document xmlns:wpc="http://schemas.microsoft.com/office/word/2010/wordprocessingCanvas" xmlns:cx="http://schemas.microsoft.com/office/drawing/2014/chartex" xmlns:cx1="http://schemas.microsoft.com/office/drawing/2015/9/8/chartex" xmlns:cx2="http://schemas.microsoft.com/office/drawing/2015/10/21/chartex" xmlns:cx3="http://schemas.microsoft.com/office/drawing/2016/5/9/chartex" xmlns:cx4="http://schemas.microsoft.com/office/drawing/2016/5/10/chartex" xmlns:cx5="http://schemas.microsoft.com/office/drawing/2016/5/11/chartex" xmlns:cx6="http://schemas.microsoft.com/office/drawing/2016/5/12/chartex" xmlns:cx7="http://schemas.microsoft.com/office/drawing/2016/5/13/chartex" xmlns:cx8="http://schemas.microsoft.com/office/drawing/2016/5/14/chartex" xmlns:mc="http://schemas.openxmlformats.org/markup-compatibility/2006" xmlns:aink="http://schemas.microsoft.com/office/drawing/2016/ink" xmlns:am3d="http://schemas.microsoft.com/office/drawing/2017/model3d" xmlns:o="urn:schemas-microsoft-com:office:office" xmlns:oel="http://schemas.microsoft.com/office/2019/extlst" xmlns:r="http://schemas.openxmlformats.org/officeDocument/2006/relationships" xmlns:m="http://schemas.openxmlformats.org/officeDocument/2006/math" xmlns:v="urn:schemas-microsoft-com:vml" xmlns:wp14="http://schemas.microsoft.com/office/word/2010/wordprocessingDrawing" xmlns:wp="http://schemas.openxmlformats.org/drawingml/2006/wordprocessingDrawing" xmlns:w10="urn:schemas-microsoft-com:office:word" xmlns:w="http://schemas.openxmlformats.org/wordprocessingml/2006/main" xmlns:w14="http://schemas.microsoft.com/office/word/2010/wordml" xmlns:w15="http://schemas.microsoft.com/office/word/2012/wordml" xmlns:w16cex="http://schemas.microsoft.com/office/word/2018/wordml/cex" xmlns:w16cid="http://schemas.microsoft.com/office/word/2016/wordml/cid" xmlns:w16="http://schemas.microsoft.com/office/word/2018/wordml" xmlns:w16du="http://schemas.microsoft.com/office/word/2023/wordml/word16du" xmlns:w16sdtdh="http://schemas.microsoft.com/office/word/2020/wordml/sdtdatahash" xmlns:w16sdtfl="http://schemas.microsoft.com/office/word/2024/wordml/sdtformatlock" xmlns:w16se="http://schemas.microsoft.com/office/word/2015/wordml/symex" xmlns:wpg="http://schemas.microsoft.com/office/word/2010/wordprocessingGroup" xmlns:wpi="http://schemas.microsoft.com/office/word/2010/wordprocessingInk" xmlns:wne="http://schemas.microsoft.com/office/word/2006/wordml" xmlns:wps="http://schemas.microsoft.com/office/word/2010/wordprocessingShape" mc:Ignorable="w14 w15 w16se w16cid w16 w16cex w16sdtdh w16sdtfl w16du wp14">
+<w:document xmlns:mc="http://schemas.openxmlformats.org/markup-compatibility/2006" xmlns:r="http://schemas.openxmlformats.org/officeDocument/2006/relationships" xmlns:w="http://schemas.openxmlformats.org/wordprocessingml/2006/main" xmlns:w14="http://schemas.microsoft.com/office/word/2010/wordml" mc:Ignorable="w14 w15 w16se w16cid w16 w16cex w16sdtdh w16sdtfl w16du wp14">
   <w:body>
     <w:p>
       <w:pPr>
@@ -205,853 +205,6 @@
         </w:rPr>
         <w:t>For use in authorized penetration testing and red team engagements only.</w:t>
       </w:r>
-    </w:p>
-    <w:p>
-      <w:pPr>
-        <w:spacing w:before="60" w:after="60"/>
-      </w:pPr>
-      <w:r>
-        <w:t xml:space="preserve"> </w:t>
-      </w:r>
-    </w:p>
-    <w:p>
-      <w:pPr>
-        <w:pStyle w:val="Heading2"/>
-        <w:pBdr>
-          <w:bottom w:val="single" w:sz="4" w:space="2" w:color="2471A3"/>
-        </w:pBdr>
-      </w:pPr>
-      <w:bookmarkStart w:id="100" w:name="_Toc224561350"/>
-      <w:r>
-        <w:t>4.5  Encryption Auditor  (--encryption)</w:t>
-      </w:r>
-      <w:bookmarkEnd w:id="100"/>
-    </w:p>
-    <w:p>
-      <w:pPr>
-        <w:spacing w:before="60" w:after="80"/>
-      </w:pPr>
-      <w:r>
-        <w:rPr>
-          <w:color w:val="333333"/>
-        </w:rPr>
-        <w:t>Audits Kerberos encryption type configuration across all domain accounts and Domain Controllers. Weak encryption (RC4/DES) enables faster offline cracking and downgrade attacks.</w:t>
-      </w:r>
-    </w:p>
-    <w:p>
-      <w:pPr>
-        <w:spacing w:before="60" w:after="60"/>
-      </w:pPr>
-      <w:r>
-        <w:t xml:space="preserve"> </w:t>
-      </w:r>
-    </w:p>
-    <w:p>
-      <w:pPr>
-        <w:spacing w:before="60" w:after="80"/>
-      </w:pPr>
-      <w:r>
-        <w:rPr>
-          <w:color w:val="333333"/>
-        </w:rPr>
-        <w:t>The module queries msDS-SupportedEncryptionTypes for all enabled user accounts and all DCs (userAccountControl bit 8192).</w:t>
-      </w:r>
-    </w:p>
-    <w:p>
-      <w:pPr>
-        <w:spacing w:before="60" w:after="60"/>
-      </w:pPr>
-      <w:r>
-        <w:t xml:space="preserve"> </w:t>
-      </w:r>
-    </w:p>
-    <w:tbl>
-      <w:tblPr>
-        <w:tblW w:w="9360" w:type="dxa"/>
-        <w:tblBorders>
-          <w:top w:val="single" w:sz="4" w:space="0" w:color="auto"/>
-          <w:left w:val="single" w:sz="4" w:space="0" w:color="auto"/>
-          <w:bottom w:val="single" w:sz="4" w:space="0" w:color="auto"/>
-          <w:right w:val="single" w:sz="4" w:space="0" w:color="auto"/>
-          <w:insideH w:val="single" w:sz="4" w:space="0" w:color="auto"/>
-          <w:insideV w:val="single" w:sz="4" w:space="0" w:color="auto"/>
-        </w:tblBorders>
-        <w:tblCellMar>
-          <w:left w:w="10" w:type="dxa"/>
-          <w:right w:w="10" w:type="dxa"/>
-        </w:tblCellMar>
-        <w:tblLook w:val="0000" w:firstRow="0" w:lastRow="0" w:firstColumn="0" w:lastColumn="0" w:noHBand="0" w:noVBand="0"/>
-      </w:tblPr>
-      <w:tblGrid>
-        <w:gridCol w:w="3120"/>
-        <w:gridCol w:w="3120"/>
-        <w:gridCol w:w="3120"/>
-      </w:tblGrid>
-      <w:tr>
-        <w:tc>
-          <w:tcPr>
-            <w:tcW w:w="3120" w:type="dxa"/>
-            <w:shd w:val="clear" w:color="auto" w:fill="2C3E50"/>
-            <w:tcMar>
-              <w:top w:w="80" w:type="dxa"/>
-              <w:bottom w:w="80" w:type="dxa"/>
-              <w:left w:w="120" w:type="dxa"/>
-              <w:right w:w="120" w:type="dxa"/>
-            </w:tcMar>
-          </w:tcPr>
-          <w:p>
-            <w:r>
-              <w:rPr>
-                <w:b/>
-                <w:bCs/>
-                <w:color w:val="FFFFFF"/>
-                <w:sz w:val="20"/>
-                <w:szCs w:val="20"/>
-              </w:rPr>
-              <w:t>Check</w:t>
-            </w:r>
-          </w:p>
-        </w:tc>
-        <w:tc>
-          <w:tcPr>
-            <w:tcW w:w="3120" w:type="dxa"/>
-            <w:shd w:val="clear" w:color="auto" w:fill="2C3E50"/>
-            <w:tcMar>
-              <w:top w:w="80" w:type="dxa"/>
-              <w:bottom w:w="80" w:type="dxa"/>
-              <w:left w:w="120" w:type="dxa"/>
-              <w:right w:w="120" w:type="dxa"/>
-            </w:tcMar>
-          </w:tcPr>
-          <w:p>
-            <w:r>
-              <w:rPr>
-                <w:b/>
-                <w:bCs/>
-                <w:color w:val="FFFFFF"/>
-                <w:sz w:val="20"/>
-                <w:szCs w:val="20"/>
-              </w:rPr>
-              <w:t>Condition</w:t>
-            </w:r>
-          </w:p>
-        </w:tc>
-        <w:tc>
-          <w:tcPr>
-            <w:tcW w:w="3120" w:type="dxa"/>
-            <w:shd w:val="clear" w:color="auto" w:fill="2C3E50"/>
-            <w:tcMar>
-              <w:top w:w="80" w:type="dxa"/>
-              <w:bottom w:w="80" w:type="dxa"/>
-              <w:left w:w="120" w:type="dxa"/>
-              <w:right w:w="120" w:type="dxa"/>
-            </w:tcMar>
-          </w:tcPr>
-          <w:p>
-            <w:r>
-              <w:rPr>
-                <w:b/>
-                <w:bCs/>
-                <w:color w:val="FFFFFF"/>
-                <w:sz w:val="20"/>
-                <w:szCs w:val="20"/>
-              </w:rPr>
-              <w:t>Risk</w:t>
-            </w:r>
-          </w:p>
-        </w:tc>
-      </w:tr>
-      <w:tr>
-        <w:tc>
-          <w:tcPr>
-            <w:tcW w:w="3120" w:type="dxa"/>
-            <w:tcMar>
-              <w:top w:w="60" w:type="dxa"/>
-              <w:bottom w:w="60" w:type="dxa"/>
-              <w:left w:w="120" w:type="dxa"/>
-              <w:right w:w="120" w:type="dxa"/>
-            </w:tcMar>
-          </w:tcPr>
-          <w:p>
-            <w:r>
-              <w:rPr>
-                <w:color w:val="333333"/>
-                <w:sz w:val="20"/>
-                <w:szCs w:val="20"/>
-              </w:rPr>
-              <w:t>RC4-only accounts</w:t>
-            </w:r>
-          </w:p>
-        </w:tc>
-        <w:tc>
-          <w:tcPr>
-            <w:tcW w:w="3120" w:type="dxa"/>
-            <w:tcMar>
-              <w:top w:w="60" w:type="dxa"/>
-              <w:bottom w:w="60" w:type="dxa"/>
-              <w:left w:w="120" w:type="dxa"/>
-              <w:right w:w="120" w:type="dxa"/>
-            </w:tcMar>
-          </w:tcPr>
-          <w:p>
-            <w:r>
-              <w:rPr>
-                <w:color w:val="333333"/>
-                <w:sz w:val="20"/>
-                <w:szCs w:val="20"/>
-              </w:rPr>
-              <w:t>enc=0 or RC4 set without AES</w:t>
-            </w:r>
-          </w:p>
-        </w:tc>
-        <w:tc>
-          <w:tcPr>
-            <w:tcW w:w="3120" w:type="dxa"/>
-            <w:tcMar>
-              <w:top w:w="60" w:type="dxa"/>
-              <w:bottom w:w="60" w:type="dxa"/>
-              <w:left w:w="120" w:type="dxa"/>
-              <w:right w:w="120" w:type="dxa"/>
-            </w:tcMar>
-          </w:tcPr>
-          <w:p>
-            <w:r>
-              <w:rPr>
-                <w:color w:val="333333"/>
-                <w:sz w:val="20"/>
-                <w:szCs w:val="20"/>
-              </w:rPr>
-              <w:t>HIGH</w:t>
-            </w:r>
-          </w:p>
-        </w:tc>
-      </w:tr>
-      <w:tr>
-        <w:tc>
-          <w:tcPr>
-            <w:tcW w:w="3120" w:type="dxa"/>
-            <w:tcMar>
-              <w:top w:w="60" w:type="dxa"/>
-              <w:bottom w:w="60" w:type="dxa"/>
-              <w:left w:w="120" w:type="dxa"/>
-              <w:right w:w="120" w:type="dxa"/>
-            </w:tcMar>
-          </w:tcPr>
-          <w:p>
-            <w:r>
-              <w:rPr>
-                <w:color w:val="333333"/>
-                <w:sz w:val="20"/>
-                <w:szCs w:val="20"/>
-              </w:rPr>
-              <w:t>DES accounts</w:t>
-            </w:r>
-          </w:p>
-        </w:tc>
-        <w:tc>
-          <w:tcPr>
-            <w:tcW w:w="3120" w:type="dxa"/>
-            <w:tcMar>
-              <w:top w:w="60" w:type="dxa"/>
-              <w:bottom w:w="60" w:type="dxa"/>
-              <w:left w:w="120" w:type="dxa"/>
-              <w:right w:w="120" w:type="dxa"/>
-            </w:tcMar>
-          </w:tcPr>
-          <w:p>
-            <w:r>
-              <w:rPr>
-                <w:color w:val="333333"/>
-                <w:sz w:val="20"/>
-                <w:szCs w:val="20"/>
-              </w:rPr>
-              <w:t>DES-CBC-CRC or DES-CBC-MD5 enabled</w:t>
-            </w:r>
-          </w:p>
-        </w:tc>
-        <w:tc>
-          <w:tcPr>
-            <w:tcW w:w="3120" w:type="dxa"/>
-            <w:tcMar>
-              <w:top w:w="60" w:type="dxa"/>
-              <w:bottom w:w="60" w:type="dxa"/>
-              <w:left w:w="120" w:type="dxa"/>
-              <w:right w:w="120" w:type="dxa"/>
-            </w:tcMar>
-          </w:tcPr>
-          <w:p>
-            <w:r>
-              <w:rPr>
-                <w:color w:val="333333"/>
-                <w:sz w:val="20"/>
-                <w:szCs w:val="20"/>
-              </w:rPr>
-              <w:t>CRITICAL</w:t>
-            </w:r>
-          </w:p>
-        </w:tc>
-      </w:tr>
-      <w:tr>
-        <w:tc>
-          <w:tcPr>
-            <w:tcW w:w="3120" w:type="dxa"/>
-            <w:tcMar>
-              <w:top w:w="60" w:type="dxa"/>
-              <w:bottom w:w="60" w:type="dxa"/>
-              <w:left w:w="120" w:type="dxa"/>
-              <w:right w:w="120" w:type="dxa"/>
-            </w:tcMar>
-          </w:tcPr>
-          <w:p>
-            <w:r>
-              <w:rPr>
-                <w:color w:val="333333"/>
-                <w:sz w:val="20"/>
-                <w:szCs w:val="20"/>
-              </w:rPr>
-              <w:t>Weak DCs</w:t>
-            </w:r>
-          </w:p>
-        </w:tc>
-        <w:tc>
-          <w:tcPr>
-            <w:tcW w:w="3120" w:type="dxa"/>
-            <w:tcMar>
-              <w:top w:w="60" w:type="dxa"/>
-              <w:bottom w:w="60" w:type="dxa"/>
-              <w:left w:w="120" w:type="dxa"/>
-              <w:right w:w="120" w:type="dxa"/>
-            </w:tcMar>
-          </w:tcPr>
-          <w:p>
-            <w:r>
-              <w:rPr>
-                <w:color w:val="333333"/>
-                <w:sz w:val="20"/>
-                <w:szCs w:val="20"/>
-              </w:rPr>
-              <w:t>DC supports RC4 or has no explicit AES</w:t>
-            </w:r>
-          </w:p>
-        </w:tc>
-        <w:tc>
-          <w:tcPr>
-            <w:tcW w:w="3120" w:type="dxa"/>
-            <w:tcMar>
-              <w:top w:w="60" w:type="dxa"/>
-              <w:bottom w:w="60" w:type="dxa"/>
-              <w:left w:w="120" w:type="dxa"/>
-              <w:right w:w="120" w:type="dxa"/>
-            </w:tcMar>
-          </w:tcPr>
-          <w:p>
-            <w:r>
-              <w:rPr>
-                <w:color w:val="333333"/>
-                <w:sz w:val="20"/>
-                <w:szCs w:val="20"/>
-              </w:rPr>
-              <w:t>HIGH</w:t>
-            </w:r>
-          </w:p>
-        </w:tc>
-      </w:tr>
-    </w:tbl>
-    <w:p>
-      <w:pPr>
-        <w:spacing w:before="60" w:after="60"/>
-      </w:pPr>
-      <w:r>
-        <w:t xml:space="preserve"> </w:t>
-      </w:r>
-    </w:p>
-    <w:p>
-      <w:pPr>
-        <w:spacing w:before="60" w:after="80"/>
-      </w:pPr>
-      <w:r>
-        <w:rPr>
-          <w:color w:val="333333"/>
-        </w:rPr>
-        <w:t>All findings feed into the priority scorer — weak DCs score 65 (HIGH), DES accounts score 60 (HIGH).</w:t>
-      </w:r>
-    </w:p>
-    <w:p>
-      <w:pPr>
-        <w:spacing w:before="60" w:after="60"/>
-      </w:pPr>
-      <w:r>
-        <w:t xml:space="preserve"> </w:t>
-      </w:r>
-    </w:p>
-    <w:p>
-      <w:pPr>
-        <w:pStyle w:val="Heading2"/>
-        <w:pBdr>
-          <w:bottom w:val="single" w:sz="4" w:space="2" w:color="2471A3"/>
-        </w:pBdr>
-      </w:pPr>
-      <w:bookmarkStart w:id="101" w:name="_Toc224561351"/>
-      <w:r>
-        <w:t>4.6  Trust Mapper  (--trusts)</w:t>
-      </w:r>
-      <w:bookmarkEnd w:id="101"/>
-    </w:p>
-    <w:p>
-      <w:pPr>
-        <w:spacing w:before="60" w:after="80"/>
-      </w:pPr>
-      <w:r>
-        <w:rPr>
-          <w:color w:val="333333"/>
-        </w:rPr>
-        <w:t>Enumerates all domain trusts and assesses their risk based on direction, type, SID filtering status, and encryption.</w:t>
-      </w:r>
-    </w:p>
-    <w:p>
-      <w:pPr>
-        <w:spacing w:before="60" w:after="60"/>
-      </w:pPr>
-      <w:r>
-        <w:t xml:space="preserve"> </w:t>
-      </w:r>
-    </w:p>
-    <w:p>
-      <w:pPr>
-        <w:spacing w:before="60" w:after="80"/>
-      </w:pPr>
-      <w:r>
-        <w:rPr>
-          <w:color w:val="333333"/>
-        </w:rPr>
-        <w:t>LDAP filter: (objectClass=trustedDomain)</w:t>
-      </w:r>
-    </w:p>
-    <w:p>
-      <w:pPr>
-        <w:spacing w:before="60" w:after="80"/>
-      </w:pPr>
-      <w:r>
-        <w:rPr>
-          <w:color w:val="333333"/>
-        </w:rPr>
-        <w:t>Attributes: name, trustDirection, trustType, trustAttributes, securityIdentifier</w:t>
-      </w:r>
-    </w:p>
-    <w:p>
-      <w:pPr>
-        <w:spacing w:before="60" w:after="60"/>
-      </w:pPr>
-      <w:r>
-        <w:t xml:space="preserve"> </w:t>
-      </w:r>
-    </w:p>
-    <w:p>
-      <w:pPr>
-        <w:pStyle w:val="Heading3"/>
-      </w:pPr>
-      <w:r>
-        <w:t>Risk Assessment</w:t>
-      </w:r>
-    </w:p>
-    <w:p>
-      <w:pPr>
-        <w:spacing w:before="60" w:after="60"/>
-      </w:pPr>
-      <w:r>
-        <w:t xml:space="preserve"> </w:t>
-      </w:r>
-    </w:p>
-    <w:tbl>
-      <w:tblPr>
-        <w:tblW w:w="9360" w:type="dxa"/>
-        <w:tblBorders>
-          <w:top w:val="single" w:sz="4" w:space="0" w:color="auto"/>
-          <w:left w:val="single" w:sz="4" w:space="0" w:color="auto"/>
-          <w:bottom w:val="single" w:sz="4" w:space="0" w:color="auto"/>
-          <w:right w:val="single" w:sz="4" w:space="0" w:color="auto"/>
-          <w:insideH w:val="single" w:sz="4" w:space="0" w:color="auto"/>
-          <w:insideV w:val="single" w:sz="4" w:space="0" w:color="auto"/>
-        </w:tblBorders>
-        <w:tblCellMar>
-          <w:left w:w="10" w:type="dxa"/>
-          <w:right w:w="10" w:type="dxa"/>
-        </w:tblCellMar>
-        <w:tblLook w:val="0000" w:firstRow="0" w:lastRow="0" w:firstColumn="0" w:lastColumn="0" w:noHBand="0" w:noVBand="0"/>
-      </w:tblPr>
-      <w:tblGrid>
-        <w:gridCol w:w="3120"/>
-        <w:gridCol w:w="1560"/>
-        <w:gridCol w:w="4680"/>
-      </w:tblGrid>
-      <w:tr>
-        <w:tc>
-          <w:tcPr>
-            <w:tcW w:w="3120" w:type="dxa"/>
-            <w:shd w:val="clear" w:color="auto" w:fill="2C3E50"/>
-            <w:tcMar>
-              <w:top w:w="80" w:type="dxa"/>
-              <w:bottom w:w="80" w:type="dxa"/>
-              <w:left w:w="120" w:type="dxa"/>
-              <w:right w:w="120" w:type="dxa"/>
-            </w:tcMar>
-          </w:tcPr>
-          <w:p>
-            <w:r>
-              <w:rPr>
-                <w:b/>
-                <w:bCs/>
-                <w:color w:val="FFFFFF"/>
-                <w:sz w:val="20"/>
-                <w:szCs w:val="20"/>
-              </w:rPr>
-              <w:t>Configuration</w:t>
-            </w:r>
-          </w:p>
-        </w:tc>
-        <w:tc>
-          <w:tcPr>
-            <w:tcW w:w="1560" w:type="dxa"/>
-            <w:shd w:val="clear" w:color="auto" w:fill="2C3E50"/>
-            <w:tcMar>
-              <w:top w:w="80" w:type="dxa"/>
-              <w:bottom w:w="80" w:type="dxa"/>
-              <w:left w:w="120" w:type="dxa"/>
-              <w:right w:w="120" w:type="dxa"/>
-            </w:tcMar>
-          </w:tcPr>
-          <w:p>
-            <w:r>
-              <w:rPr>
-                <w:b/>
-                <w:bCs/>
-                <w:color w:val="FFFFFF"/>
-                <w:sz w:val="20"/>
-                <w:szCs w:val="20"/>
-              </w:rPr>
-              <w:t>Risk</w:t>
-            </w:r>
-          </w:p>
-        </w:tc>
-        <w:tc>
-          <w:tcPr>
-            <w:tcW w:w="4680" w:type="dxa"/>
-            <w:shd w:val="clear" w:color="auto" w:fill="2C3E50"/>
-            <w:tcMar>
-              <w:top w:w="80" w:type="dxa"/>
-              <w:bottom w:w="80" w:type="dxa"/>
-              <w:left w:w="120" w:type="dxa"/>
-              <w:right w:w="120" w:type="dxa"/>
-            </w:tcMar>
-          </w:tcPr>
-          <w:p>
-            <w:r>
-              <w:rPr>
-                <w:b/>
-                <w:bCs/>
-                <w:color w:val="FFFFFF"/>
-                <w:sz w:val="20"/>
-                <w:szCs w:val="20"/>
-              </w:rPr>
-              <w:t>Why</w:t>
-            </w:r>
-          </w:p>
-        </w:tc>
-      </w:tr>
-      <w:tr>
-        <w:tc>
-          <w:tcPr>
-            <w:tcW w:w="3120" w:type="dxa"/>
-            <w:tcMar>
-              <w:top w:w="60" w:type="dxa"/>
-              <w:bottom w:w="60" w:type="dxa"/>
-              <w:left w:w="120" w:type="dxa"/>
-              <w:right w:w="120" w:type="dxa"/>
-            </w:tcMar>
-          </w:tcPr>
-          <w:p>
-            <w:r>
-              <w:rPr>
-                <w:color w:val="333333"/>
-                <w:sz w:val="20"/>
-                <w:szCs w:val="20"/>
-              </w:rPr>
-              <w:t>Forest trust + SID filtering OFF</w:t>
-            </w:r>
-          </w:p>
-        </w:tc>
-        <w:tc>
-          <w:tcPr>
-            <w:tcW w:w="1560" w:type="dxa"/>
-            <w:tcMar>
-              <w:top w:w="60" w:type="dxa"/>
-              <w:bottom w:w="60" w:type="dxa"/>
-              <w:left w:w="120" w:type="dxa"/>
-              <w:right w:w="120" w:type="dxa"/>
-            </w:tcMar>
-          </w:tcPr>
-          <w:p>
-            <w:r>
-              <w:rPr>
-                <w:color w:val="333333"/>
-                <w:sz w:val="20"/>
-                <w:szCs w:val="20"/>
-              </w:rPr>
-              <w:t>CRITICAL</w:t>
-            </w:r>
-          </w:p>
-        </w:tc>
-        <w:tc>
-          <w:tcPr>
-            <w:tcW w:w="4680" w:type="dxa"/>
-            <w:tcMar>
-              <w:top w:w="60" w:type="dxa"/>
-              <w:bottom w:w="60" w:type="dxa"/>
-              <w:left w:w="120" w:type="dxa"/>
-              <w:right w:w="120" w:type="dxa"/>
-            </w:tcMar>
-          </w:tcPr>
-          <w:p>
-            <w:r>
-              <w:rPr>
-                <w:color w:val="333333"/>
-                <w:sz w:val="20"/>
-                <w:szCs w:val="20"/>
-              </w:rPr>
-              <w:t>SID history injection across forest boundary</w:t>
-            </w:r>
-          </w:p>
-        </w:tc>
-      </w:tr>
-      <w:tr>
-        <w:tc>
-          <w:tcPr>
-            <w:tcW w:w="3120" w:type="dxa"/>
-            <w:tcMar>
-              <w:top w:w="60" w:type="dxa"/>
-              <w:bottom w:w="60" w:type="dxa"/>
-              <w:left w:w="120" w:type="dxa"/>
-              <w:right w:w="120" w:type="dxa"/>
-            </w:tcMar>
-          </w:tcPr>
-          <w:p>
-            <w:r>
-              <w:rPr>
-                <w:color w:val="333333"/>
-                <w:sz w:val="20"/>
-                <w:szCs w:val="20"/>
-              </w:rPr>
-              <w:t>Bidirectional + no SID filtering</w:t>
-            </w:r>
-          </w:p>
-        </w:tc>
-        <w:tc>
-          <w:tcPr>
-            <w:tcW w:w="1560" w:type="dxa"/>
-            <w:tcMar>
-              <w:top w:w="60" w:type="dxa"/>
-              <w:bottom w:w="60" w:type="dxa"/>
-              <w:left w:w="120" w:type="dxa"/>
-              <w:right w:w="120" w:type="dxa"/>
-            </w:tcMar>
-          </w:tcPr>
-          <w:p>
-            <w:r>
-              <w:rPr>
-                <w:color w:val="333333"/>
-                <w:sz w:val="20"/>
-                <w:szCs w:val="20"/>
-              </w:rPr>
-              <w:t>HIGH</w:t>
-            </w:r>
-          </w:p>
-        </w:tc>
-        <w:tc>
-          <w:tcPr>
-            <w:tcW w:w="4680" w:type="dxa"/>
-            <w:tcMar>
-              <w:top w:w="60" w:type="dxa"/>
-              <w:bottom w:w="60" w:type="dxa"/>
-              <w:left w:w="120" w:type="dxa"/>
-              <w:right w:w="120" w:type="dxa"/>
-            </w:tcMar>
-          </w:tcPr>
-          <w:p>
-            <w:r>
-              <w:rPr>
-                <w:color w:val="333333"/>
-                <w:sz w:val="20"/>
-                <w:szCs w:val="20"/>
-              </w:rPr>
-              <w:t>Pivot path with SID history abuse</w:t>
-            </w:r>
-          </w:p>
-        </w:tc>
-      </w:tr>
-      <w:tr>
-        <w:tc>
-          <w:tcPr>
-            <w:tcW w:w="3120" w:type="dxa"/>
-            <w:tcMar>
-              <w:top w:w="60" w:type="dxa"/>
-              <w:bottom w:w="60" w:type="dxa"/>
-              <w:left w:w="120" w:type="dxa"/>
-              <w:right w:w="120" w:type="dxa"/>
-            </w:tcMar>
-          </w:tcPr>
-          <w:p>
-            <w:r>
-              <w:rPr>
-                <w:color w:val="333333"/>
-                <w:sz w:val="20"/>
-                <w:szCs w:val="20"/>
-              </w:rPr>
-              <w:t>Bidirectional trust</w:t>
-            </w:r>
-          </w:p>
-        </w:tc>
-        <w:tc>
-          <w:tcPr>
-            <w:tcW w:w="1560" w:type="dxa"/>
-            <w:tcMar>
-              <w:top w:w="60" w:type="dxa"/>
-              <w:bottom w:w="60" w:type="dxa"/>
-              <w:left w:w="120" w:type="dxa"/>
-              <w:right w:w="120" w:type="dxa"/>
-            </w:tcMar>
-          </w:tcPr>
-          <w:p>
-            <w:r>
-              <w:rPr>
-                <w:color w:val="333333"/>
-                <w:sz w:val="20"/>
-                <w:szCs w:val="20"/>
-              </w:rPr>
-              <w:t>MEDIUM</w:t>
-            </w:r>
-          </w:p>
-        </w:tc>
-        <w:tc>
-          <w:tcPr>
-            <w:tcW w:w="4680" w:type="dxa"/>
-            <w:tcMar>
-              <w:top w:w="60" w:type="dxa"/>
-              <w:bottom w:w="60" w:type="dxa"/>
-              <w:left w:w="120" w:type="dxa"/>
-              <w:right w:w="120" w:type="dxa"/>
-            </w:tcMar>
-          </w:tcPr>
-          <w:p>
-            <w:r>
-              <w:rPr>
-                <w:color w:val="333333"/>
-                <w:sz w:val="20"/>
-                <w:szCs w:val="20"/>
-              </w:rPr>
-              <w:t>Pivot possible if partner domain compromised</w:t>
-            </w:r>
-          </w:p>
-        </w:tc>
-      </w:tr>
-      <w:tr>
-        <w:tc>
-          <w:tcPr>
-            <w:tcW w:w="3120" w:type="dxa"/>
-            <w:tcMar>
-              <w:top w:w="60" w:type="dxa"/>
-              <w:bottom w:w="60" w:type="dxa"/>
-              <w:left w:w="120" w:type="dxa"/>
-              <w:right w:w="120" w:type="dxa"/>
-            </w:tcMar>
-          </w:tcPr>
-          <w:p>
-            <w:r>
-              <w:rPr>
-                <w:color w:val="333333"/>
-                <w:sz w:val="20"/>
-                <w:szCs w:val="20"/>
-              </w:rPr>
-              <w:t>RC4 encryption on trust</w:t>
-            </w:r>
-          </w:p>
-        </w:tc>
-        <w:tc>
-          <w:tcPr>
-            <w:tcW w:w="1560" w:type="dxa"/>
-            <w:tcMar>
-              <w:top w:w="60" w:type="dxa"/>
-              <w:bottom w:w="60" w:type="dxa"/>
-              <w:left w:w="120" w:type="dxa"/>
-              <w:right w:w="120" w:type="dxa"/>
-            </w:tcMar>
-          </w:tcPr>
-          <w:p>
-            <w:r>
-              <w:rPr>
-                <w:color w:val="333333"/>
-                <w:sz w:val="20"/>
-                <w:szCs w:val="20"/>
-              </w:rPr>
-              <w:t>LOW</w:t>
-            </w:r>
-          </w:p>
-        </w:tc>
-        <w:tc>
-          <w:tcPr>
-            <w:tcW w:w="4680" w:type="dxa"/>
-            <w:tcMar>
-              <w:top w:w="60" w:type="dxa"/>
-              <w:bottom w:w="60" w:type="dxa"/>
-              <w:left w:w="120" w:type="dxa"/>
-              <w:right w:w="120" w:type="dxa"/>
-            </w:tcMar>
-          </w:tcPr>
-          <w:p>
-            <w:r>
-              <w:rPr>
-                <w:color w:val="333333"/>
-                <w:sz w:val="20"/>
-                <w:szCs w:val="20"/>
-              </w:rPr>
-              <w:t>Weak encryption</w:t>
-            </w:r>
-          </w:p>
-        </w:tc>
-      </w:tr>
-    </w:tbl>
-    <w:p>
-      <w:pPr>
-        <w:spacing w:before="60" w:after="60"/>
-      </w:pPr>
-      <w:r>
-        <w:t xml:space="preserve"> </w:t>
-      </w:r>
-    </w:p>
-    <w:p>
-      <w:pPr>
-        <w:spacing w:before="60" w:after="80"/>
-      </w:pPr>
-      <w:r>
-        <w:rPr>
-          <w:color w:val="333333"/>
-        </w:rPr>
-        <w:t>Output is a Rich table showing trust partner, direction, type, SID filtering status, and risk level.</w:t>
-      </w:r>
-    </w:p>
-    <w:p>
-      <w:r>
-        <w:br w:type="page"/>
-      </w:r>
-    </w:p>
-    <w:p>
-      <w:pPr>
-        <w:sectPr>
-          <w:pgSz w:w="12240" w:h="15840"/>
-          <w:pgMar w:top="1440" w:right="1440" w:bottom="1440" w:left="1440" w:header="708" w:footer="708" w:gutter="0"/>
-          <w:cols w:space="720"/>
-          <w:docGrid w:linePitch="360"/>
-        </w:sectPr>
-      </w:pPr>
     </w:p>
     <w:p>
       <w:pPr>
@@ -3183,499 +2336,6 @@
     </w:sdt>
     <w:p>
       <w:pPr>
-        <w:spacing w:before="60" w:after="60"/>
-      </w:pPr>
-      <w:r>
-        <w:t xml:space="preserve"> </w:t>
-      </w:r>
-    </w:p>
-    <w:p>
-      <w:pPr>
-        <w:pStyle w:val="Heading2"/>
-        <w:pBdr>
-          <w:bottom w:val="single" w:sz="4" w:space="2" w:color="2471A3"/>
-        </w:pBdr>
-      </w:pPr>
-      <w:bookmarkStart w:id="110" w:name="_Toc224561360"/>
-      <w:r>
-        <w:t>5.7  GPP Passwords — MS14-025</w:t>
-      </w:r>
-      <w:bookmarkEnd w:id="110"/>
-    </w:p>
-    <w:p>
-      <w:pPr>
-        <w:spacing w:before="60" w:after="80"/>
-      </w:pPr>
-      <w:r>
-        <w:rPr>
-          <w:color w:val="333333"/>
-        </w:rPr>
-        <w:t>Group Policy Preferences created before KB2962486 may store passwords encrypted with a publicly known AES key. Any domain user can read SYSVOL and decrypt these passwords.</w:t>
-      </w:r>
-    </w:p>
-    <w:p>
-      <w:pPr>
-        <w:spacing w:before="60" w:after="60"/>
-      </w:pPr>
-      <w:r>
-        <w:t xml:space="preserve"> </w:t>
-      </w:r>
-    </w:p>
-    <w:p>
-      <w:pPr>
-        <w:spacing w:before="60" w:after="80"/>
-      </w:pPr>
-      <w:r>
-        <w:rPr>
-          <w:color w:val="333333"/>
-        </w:rPr>
-        <w:t>Detection: Queries all groupPolicyContainer objects via LDAP and checks gPCFileSysPath attributes for SYSVOL paths containing potential cpassword XML files (Groups.xml, ScheduledTasks.xml, Services.xml, DataSources.xml).</w:t>
-      </w:r>
-    </w:p>
-    <w:p>
-      <w:pPr>
-        <w:spacing w:before="60" w:after="60"/>
-      </w:pPr>
-      <w:r>
-        <w:t xml:space="preserve"> </w:t>
-      </w:r>
-    </w:p>
-    <w:p>
-      <w:pPr>
-        <w:spacing w:before="60" w:after="80"/>
-      </w:pPr>
-      <w:r>
-        <w:rPr>
-          <w:color w:val="333333"/>
-        </w:rPr>
-        <w:t>Remediation: Apply KB2962486, delete existing GPP XML files containing cpassword, reset affected passwords.</w:t>
-      </w:r>
-    </w:p>
-    <w:p>
-      <w:pPr>
-        <w:spacing w:before="60" w:after="60"/>
-      </w:pPr>
-      <w:r>
-        <w:t xml:space="preserve"> </w:t>
-      </w:r>
-    </w:p>
-    <w:tbl>
-      <w:tblPr>
-        <w:tblW w:w="9360" w:type="dxa"/>
-        <w:tblBorders>
-          <w:top w:val="none" w:sz="0" w:space="0" w:color="auto"/>
-          <w:left w:val="none" w:sz="0" w:space="0" w:color="auto"/>
-          <w:bottom w:val="none" w:sz="0" w:space="0" w:color="auto"/>
-          <w:right w:val="none" w:sz="0" w:space="0" w:color="auto"/>
-        </w:tblBorders>
-        <w:tblCellMar>
-          <w:left w:w="10" w:type="dxa"/>
-          <w:right w:w="10" w:type="dxa"/>
-        </w:tblCellMar>
-        <w:tblLook w:val="0000" w:firstRow="0" w:lastRow="0" w:firstColumn="0" w:lastColumn="0" w:noHBand="0" w:noVBand="0"/>
-      </w:tblPr>
-      <w:tblGrid>
-        <w:gridCol w:w="9360"/>
-      </w:tblGrid>
-      <w:tr>
-        <w:tc>
-          <w:tcPr>
-            <w:tcW w:w="9360" w:type="dxa"/>
-            <w:shd w:val="clear" w:color="auto" w:fill="2C3E50"/>
-            <w:tcMar>
-              <w:top w:w="120" w:type="dxa"/>
-              <w:bottom w:w="120" w:type="dxa"/>
-              <w:left w:w="200" w:type="dxa"/>
-              <w:right w:w="200" w:type="dxa"/>
-            </w:tcMar>
-          </w:tcPr>
-          <w:p>
-            <w:r>
-              <w:rPr>
-                <w:rFonts w:ascii="Courier New" w:eastAsia="Courier New" w:hAnsi="Courier New" w:cs="Courier New"/>
-                <w:color w:val="A8D8EA"/>
-                <w:sz w:val="18"/>
-                <w:szCs w:val="18"/>
-              </w:rPr>
-              <w:t>Get-GPPPassword.py domain/user:pass@DC_IP</w:t>
-            </w:r>
-          </w:p>
-        </w:tc>
-      </w:tr>
-    </w:tbl>
-    <w:p>
-      <w:pPr>
-        <w:spacing w:before="60" w:after="60"/>
-      </w:pPr>
-      <w:r>
-        <w:t xml:space="preserve"> </w:t>
-      </w:r>
-    </w:p>
-    <w:p>
-      <w:pPr>
-        <w:pStyle w:val="Heading2"/>
-        <w:pBdr>
-          <w:bottom w:val="single" w:sz="4" w:space="2" w:color="2471A3"/>
-        </w:pBdr>
-      </w:pPr>
-      <w:bookmarkStart w:id="111" w:name="_Toc224561361"/>
-      <w:r>
-        <w:t>5.8  Bronze Bit — CVE-2020-17049</w:t>
-      </w:r>
-      <w:bookmarkEnd w:id="111"/>
-    </w:p>
-    <w:p>
-      <w:pPr>
-        <w:spacing w:before="60" w:after="80"/>
-      </w:pPr>
-      <w:r>
-        <w:rPr>
-          <w:color w:val="333333"/>
-        </w:rPr>
-        <w:t>Bypasses the S4U2Self forwardable flag validation in constrained delegation. An attacker with a constrained delegation account can impersonate any user to any service in the delegation list, even without protocol transition enabled.</w:t>
-      </w:r>
-    </w:p>
-    <w:p>
-      <w:pPr>
-        <w:spacing w:before="60" w:after="60"/>
-      </w:pPr>
-      <w:r>
-        <w:t xml:space="preserve"> </w:t>
-      </w:r>
-    </w:p>
-    <w:p>
-      <w:pPr>
-        <w:spacing w:before="60" w:after="80"/>
-      </w:pPr>
-      <w:r>
-        <w:rPr>
-          <w:color w:val="333333"/>
-        </w:rPr>
-        <w:t>Detection: Checks if constrained delegation accounts exist AND the domain functional level suggests the patch (KB4598347) has not been applied (DFL &lt; 7).</w:t>
-      </w:r>
-    </w:p>
-    <w:p>
-      <w:pPr>
-        <w:spacing w:before="60" w:after="60"/>
-      </w:pPr>
-      <w:r>
-        <w:t xml:space="preserve"> </w:t>
-      </w:r>
-    </w:p>
-    <w:p>
-      <w:pPr>
-        <w:spacing w:before="60" w:after="80"/>
-      </w:pPr>
-      <w:r>
-        <w:rPr>
-          <w:color w:val="333333"/>
-        </w:rPr>
-        <w:t>Remediation: Apply KB4598347 on all DCs, set PerformTicketSignature=2 registry key.</w:t>
-      </w:r>
-    </w:p>
-    <w:p>
-      <w:pPr>
-        <w:spacing w:before="60" w:after="60"/>
-      </w:pPr>
-      <w:r>
-        <w:t xml:space="preserve"> </w:t>
-      </w:r>
-    </w:p>
-    <w:tbl>
-      <w:tblPr>
-        <w:tblW w:w="9360" w:type="dxa"/>
-        <w:tblBorders>
-          <w:top w:val="none" w:sz="0" w:space="0" w:color="auto"/>
-          <w:left w:val="none" w:sz="0" w:space="0" w:color="auto"/>
-          <w:bottom w:val="none" w:sz="0" w:space="0" w:color="auto"/>
-          <w:right w:val="none" w:sz="0" w:space="0" w:color="auto"/>
-        </w:tblBorders>
-        <w:tblCellMar>
-          <w:left w:w="10" w:type="dxa"/>
-          <w:right w:w="10" w:type="dxa"/>
-        </w:tblCellMar>
-        <w:tblLook w:val="0000" w:firstRow="0" w:lastRow="0" w:firstColumn="0" w:lastColumn="0" w:noHBand="0" w:noVBand="0"/>
-      </w:tblPr>
-      <w:tblGrid>
-        <w:gridCol w:w="9360"/>
-      </w:tblGrid>
-      <w:tr>
-        <w:tc>
-          <w:tcPr>
-            <w:tcW w:w="9360" w:type="dxa"/>
-            <w:shd w:val="clear" w:color="auto" w:fill="2C3E50"/>
-            <w:tcMar>
-              <w:top w:w="120" w:type="dxa"/>
-              <w:bottom w:w="120" w:type="dxa"/>
-              <w:left w:w="200" w:type="dxa"/>
-              <w:right w:w="200" w:type="dxa"/>
-            </w:tcMar>
-          </w:tcPr>
-          <w:p>
-            <w:r>
-              <w:rPr>
-                <w:rFonts w:ascii="Courier New" w:eastAsia="Courier New" w:hAnsi="Courier New" w:cs="Courier New"/>
-                <w:color w:val="A8D8EA"/>
-                <w:sz w:val="18"/>
-                <w:szCs w:val="18"/>
-              </w:rPr>
-              <w:t>getST.py -spn TARGET_SPN -impersonate Administrator -force-forwardable -dc-ip DC_IP domain/user:pass</w:t>
-            </w:r>
-          </w:p>
-        </w:tc>
-      </w:tr>
-    </w:tbl>
-    <w:p>
-      <w:pPr>
-        <w:spacing w:before="60" w:after="60"/>
-      </w:pPr>
-      <w:r>
-        <w:t xml:space="preserve"> </w:t>
-      </w:r>
-    </w:p>
-    <w:p>
-      <w:pPr>
-        <w:pStyle w:val="Heading2"/>
-        <w:pBdr>
-          <w:bottom w:val="single" w:sz="4" w:space="2" w:color="2471A3"/>
-        </w:pBdr>
-      </w:pPr>
-      <w:bookmarkStart w:id="112" w:name="_Toc224561362"/>
-      <w:r>
-        <w:t>5.9  Certifried — CVE-2022-26923</w:t>
-      </w:r>
-      <w:bookmarkEnd w:id="112"/>
-    </w:p>
-    <w:p>
-      <w:pPr>
-        <w:spacing w:before="60" w:after="80"/>
-      </w:pPr>
-      <w:r>
-        <w:rPr>
-          <w:color w:val="333333"/>
-        </w:rPr>
-        <w:t>Any domain user can create a machine account (if MachineAccountQuota &gt; 0), set its dNSHostName to match a DC, request a certificate, and authenticate as the DC — full domain compromise. Severity: CRITICAL.</w:t>
-      </w:r>
-    </w:p>
-    <w:p>
-      <w:pPr>
-        <w:spacing w:before="60" w:after="60"/>
-      </w:pPr>
-      <w:r>
-        <w:t xml:space="preserve"> </w:t>
-      </w:r>
-    </w:p>
-    <w:p>
-      <w:pPr>
-        <w:spacing w:before="60" w:after="80"/>
-      </w:pPr>
-      <w:r>
-        <w:rPr>
-          <w:color w:val="333333"/>
-        </w:rPr>
-        <w:t>Detection: Checks three conditions via LDAP: (1) AD CS enrollment services exist, (2) ms-DS-MachineAccountQuota &gt; 0, (3) domain appears unpatched (DFL &lt; 7).</w:t>
-      </w:r>
-    </w:p>
-    <w:p>
-      <w:pPr>
-        <w:spacing w:before="60" w:after="60"/>
-      </w:pPr>
-      <w:r>
-        <w:t xml:space="preserve"> </w:t>
-      </w:r>
-    </w:p>
-    <w:p>
-      <w:pPr>
-        <w:spacing w:before="60" w:after="80"/>
-      </w:pPr>
-      <w:r>
-        <w:rPr>
-          <w:color w:val="333333"/>
-        </w:rPr>
-        <w:t>Remediation: Apply KB5014754 (May 2022 updates), set MachineAccountQuota=0, enable strong certificate mapping.</w:t>
-      </w:r>
-    </w:p>
-    <w:p>
-      <w:pPr>
-        <w:spacing w:before="60" w:after="60"/>
-      </w:pPr>
-      <w:r>
-        <w:t xml:space="preserve"> </w:t>
-      </w:r>
-    </w:p>
-    <w:tbl>
-      <w:tblPr>
-        <w:tblW w:w="9360" w:type="dxa"/>
-        <w:tblBorders>
-          <w:top w:val="none" w:sz="0" w:space="0" w:color="auto"/>
-          <w:left w:val="none" w:sz="0" w:space="0" w:color="auto"/>
-          <w:bottom w:val="none" w:sz="0" w:space="0" w:color="auto"/>
-          <w:right w:val="none" w:sz="0" w:space="0" w:color="auto"/>
-        </w:tblBorders>
-        <w:tblCellMar>
-          <w:left w:w="10" w:type="dxa"/>
-          <w:right w:w="10" w:type="dxa"/>
-        </w:tblCellMar>
-        <w:tblLook w:val="0000" w:firstRow="0" w:lastRow="0" w:firstColumn="0" w:lastColumn="0" w:noHBand="0" w:noVBand="0"/>
-      </w:tblPr>
-      <w:tblGrid>
-        <w:gridCol w:w="9360"/>
-      </w:tblGrid>
-      <w:tr>
-        <w:tc>
-          <w:tcPr>
-            <w:tcW w:w="9360" w:type="dxa"/>
-            <w:shd w:val="clear" w:color="auto" w:fill="2C3E50"/>
-            <w:tcMar>
-              <w:top w:w="120" w:type="dxa"/>
-              <w:bottom w:w="120" w:type="dxa"/>
-              <w:left w:w="200" w:type="dxa"/>
-              <w:right w:w="200" w:type="dxa"/>
-            </w:tcMar>
-          </w:tcPr>
-          <w:p>
-            <w:r>
-              <w:rPr>
-                <w:rFonts w:ascii="Courier New" w:eastAsia="Courier New" w:hAnsi="Courier New" w:cs="Courier New"/>
-                <w:color w:val="A8D8EA"/>
-                <w:sz w:val="18"/>
-                <w:szCs w:val="18"/>
-              </w:rPr>
-              <w:t>certipy account create -u user@domain -p pass -dc-ip DC_IP -user FAKE$ -dns DC_FQDN</w:t>
-            </w:r>
-          </w:p>
-        </w:tc>
-      </w:tr>
-    </w:tbl>
-    <w:p>
-      <w:pPr>
-        <w:spacing w:before="60" w:after="60"/>
-      </w:pPr>
-      <w:r>
-        <w:t xml:space="preserve"> </w:t>
-      </w:r>
-    </w:p>
-    <w:p>
-      <w:pPr>
-        <w:pStyle w:val="Heading2"/>
-        <w:pBdr>
-          <w:bottom w:val="single" w:sz="4" w:space="2" w:color="2471A3"/>
-        </w:pBdr>
-      </w:pPr>
-      <w:bookmarkStart w:id="113" w:name="_Toc224561363"/>
-      <w:r>
-        <w:t>5.10  LDAP Signing Not Required</w:t>
-      </w:r>
-      <w:bookmarkEnd w:id="113"/>
-    </w:p>
-    <w:p>
-      <w:pPr>
-        <w:spacing w:before="60" w:after="80"/>
-      </w:pPr>
-      <w:r>
-        <w:rPr>
-          <w:color w:val="333333"/>
-        </w:rPr>
-        <w:t>If LDAP signing is not enforced on the DC, NTLM relay attacks to LDAP are possible (ntlmrelayx, mitm6, Responder). This enables privilege escalation via RBCD or delegation abuse. Severity: HIGH.</w:t>
-      </w:r>
-    </w:p>
-    <w:p>
-      <w:pPr>
-        <w:spacing w:before="60" w:after="60"/>
-      </w:pPr>
-      <w:r>
-        <w:t xml:space="preserve"> </w:t>
-      </w:r>
-    </w:p>
-    <w:p>
-      <w:pPr>
-        <w:spacing w:before="60" w:after="80"/>
-      </w:pPr>
-      <w:r>
-        <w:rPr>
-          <w:color w:val="333333"/>
-        </w:rPr>
-        <w:t>Detection: Checks whether the current LDAP connection was established without signing (port 389 vs 636/LDAPS).</w:t>
-      </w:r>
-    </w:p>
-    <w:p>
-      <w:pPr>
-        <w:spacing w:before="60" w:after="60"/>
-      </w:pPr>
-      <w:r>
-        <w:t xml:space="preserve"> </w:t>
-      </w:r>
-    </w:p>
-    <w:p>
-      <w:pPr>
-        <w:spacing w:before="60" w:after="80"/>
-      </w:pPr>
-      <w:r>
-        <w:rPr>
-          <w:color w:val="333333"/>
-        </w:rPr>
-        <w:t>Remediation: Set “Domain controller: LDAP server signing requirements” to “Require signing” via GPO. Enable LDAP channel binding (LdapEnforceChannelBinding=2).</w:t>
-      </w:r>
-    </w:p>
-    <w:p>
-      <w:pPr>
-        <w:spacing w:before="60" w:after="60"/>
-      </w:pPr>
-      <w:r>
-        <w:t xml:space="preserve"> </w:t>
-      </w:r>
-    </w:p>
-    <w:tbl>
-      <w:tblPr>
-        <w:tblW w:w="9360" w:type="dxa"/>
-        <w:tblBorders>
-          <w:top w:val="none" w:sz="0" w:space="0" w:color="auto"/>
-          <w:left w:val="none" w:sz="0" w:space="0" w:color="auto"/>
-          <w:bottom w:val="none" w:sz="0" w:space="0" w:color="auto"/>
-          <w:right w:val="none" w:sz="0" w:space="0" w:color="auto"/>
-        </w:tblBorders>
-        <w:tblCellMar>
-          <w:left w:w="10" w:type="dxa"/>
-          <w:right w:w="10" w:type="dxa"/>
-        </w:tblCellMar>
-        <w:tblLook w:val="0000" w:firstRow="0" w:lastRow="0" w:firstColumn="0" w:lastColumn="0" w:noHBand="0" w:noVBand="0"/>
-      </w:tblPr>
-      <w:tblGrid>
-        <w:gridCol w:w="9360"/>
-      </w:tblGrid>
-      <w:tr>
-        <w:tc>
-          <w:tcPr>
-            <w:tcW w:w="9360" w:type="dxa"/>
-            <w:shd w:val="clear" w:color="auto" w:fill="2C3E50"/>
-            <w:tcMar>
-              <w:top w:w="120" w:type="dxa"/>
-              <w:bottom w:w="120" w:type="dxa"/>
-              <w:left w:w="200" w:type="dxa"/>
-              <w:right w:w="200" w:type="dxa"/>
-            </w:tcMar>
-          </w:tcPr>
-          <w:p>
-            <w:r>
-              <w:rPr>
-                <w:rFonts w:ascii="Courier New" w:eastAsia="Courier New" w:hAnsi="Courier New" w:cs="Courier New"/>
-                <w:color w:val="A8D8EA"/>
-                <w:sz w:val="18"/>
-                <w:szCs w:val="18"/>
-              </w:rPr>
-              <w:t>ntlmrelayx.py -t ldap://DC_IP --delegate-access</w:t>
-            </w:r>
-          </w:p>
-        </w:tc>
-      </w:tr>
-    </w:tbl>
-    <w:p>
-      <w:r>
-        <w:br w:type="page"/>
-      </w:r>
-    </w:p>
-    <w:p>
-      <w:pPr>
         <w:pStyle w:val="Heading1"/>
       </w:pPr>
       <w:bookmarkStart w:id="1" w:name="_Toc224561281"/>
@@ -8543,6 +7203,853 @@
     </w:p>
     <w:p>
       <w:pPr>
+        <w:spacing w:before="60" w:after="60"/>
+      </w:pPr>
+      <w:r>
+        <w:t xml:space="preserve"> </w:t>
+      </w:r>
+    </w:p>
+    <w:p>
+      <w:pPr>
+        <w:pStyle w:val="Heading2"/>
+        <w:pBdr>
+          <w:bottom w:val="single" w:sz="4" w:space="2" w:color="2471A3"/>
+        </w:pBdr>
+      </w:pPr>
+      <w:bookmarkStart w:id="100" w:name="_Toc224561350"/>
+      <w:r>
+        <w:t>4.5  Encryption Auditor  (--encryption)</w:t>
+      </w:r>
+      <w:bookmarkEnd w:id="100"/>
+    </w:p>
+    <w:p>
+      <w:pPr>
+        <w:spacing w:before="60" w:after="80"/>
+      </w:pPr>
+      <w:r>
+        <w:rPr>
+          <w:color w:val="333333"/>
+        </w:rPr>
+        <w:t>Audits Kerberos encryption type configuration across all domain accounts and Domain Controllers. Weak encryption (RC4/DES) enables faster offline cracking and downgrade attacks.</w:t>
+      </w:r>
+    </w:p>
+    <w:p>
+      <w:pPr>
+        <w:spacing w:before="60" w:after="60"/>
+      </w:pPr>
+      <w:r>
+        <w:t xml:space="preserve"> </w:t>
+      </w:r>
+    </w:p>
+    <w:p>
+      <w:pPr>
+        <w:spacing w:before="60" w:after="80"/>
+      </w:pPr>
+      <w:r>
+        <w:rPr>
+          <w:color w:val="333333"/>
+        </w:rPr>
+        <w:t>The module queries msDS-SupportedEncryptionTypes for all enabled user accounts and all DCs (userAccountControl bit 8192).</w:t>
+      </w:r>
+    </w:p>
+    <w:p>
+      <w:pPr>
+        <w:spacing w:before="60" w:after="60"/>
+      </w:pPr>
+      <w:r>
+        <w:t xml:space="preserve"> </w:t>
+      </w:r>
+    </w:p>
+    <w:tbl>
+      <w:tblPr>
+        <w:tblW w:w="9360" w:type="dxa"/>
+        <w:tblBorders>
+          <w:top w:val="single" w:sz="4" w:space="0" w:color="auto"/>
+          <w:left w:val="single" w:sz="4" w:space="0" w:color="auto"/>
+          <w:bottom w:val="single" w:sz="4" w:space="0" w:color="auto"/>
+          <w:right w:val="single" w:sz="4" w:space="0" w:color="auto"/>
+          <w:insideH w:val="single" w:sz="4" w:space="0" w:color="auto"/>
+          <w:insideV w:val="single" w:sz="4" w:space="0" w:color="auto"/>
+        </w:tblBorders>
+        <w:tblCellMar>
+          <w:left w:w="10" w:type="dxa"/>
+          <w:right w:w="10" w:type="dxa"/>
+        </w:tblCellMar>
+        <w:tblLook w:val="0000" w:firstRow="0" w:lastRow="0" w:firstColumn="0" w:lastColumn="0" w:noHBand="0" w:noVBand="0"/>
+      </w:tblPr>
+      <w:tblGrid>
+        <w:gridCol w:w="3120"/>
+        <w:gridCol w:w="3120"/>
+        <w:gridCol w:w="3120"/>
+      </w:tblGrid>
+      <w:tr>
+        <w:tc>
+          <w:tcPr>
+            <w:tcW w:w="3120" w:type="dxa"/>
+            <w:shd w:val="clear" w:color="auto" w:fill="2C3E50"/>
+            <w:tcMar>
+              <w:top w:w="80" w:type="dxa"/>
+              <w:bottom w:w="80" w:type="dxa"/>
+              <w:left w:w="120" w:type="dxa"/>
+              <w:right w:w="120" w:type="dxa"/>
+            </w:tcMar>
+          </w:tcPr>
+          <w:p>
+            <w:r>
+              <w:rPr>
+                <w:b/>
+                <w:bCs/>
+                <w:color w:val="FFFFFF"/>
+                <w:sz w:val="20"/>
+                <w:szCs w:val="20"/>
+              </w:rPr>
+              <w:t>Check</w:t>
+            </w:r>
+          </w:p>
+        </w:tc>
+        <w:tc>
+          <w:tcPr>
+            <w:tcW w:w="3120" w:type="dxa"/>
+            <w:shd w:val="clear" w:color="auto" w:fill="2C3E50"/>
+            <w:tcMar>
+              <w:top w:w="80" w:type="dxa"/>
+              <w:bottom w:w="80" w:type="dxa"/>
+              <w:left w:w="120" w:type="dxa"/>
+              <w:right w:w="120" w:type="dxa"/>
+            </w:tcMar>
+          </w:tcPr>
+          <w:p>
+            <w:r>
+              <w:rPr>
+                <w:b/>
+                <w:bCs/>
+                <w:color w:val="FFFFFF"/>
+                <w:sz w:val="20"/>
+                <w:szCs w:val="20"/>
+              </w:rPr>
+              <w:t>Condition</w:t>
+            </w:r>
+          </w:p>
+        </w:tc>
+        <w:tc>
+          <w:tcPr>
+            <w:tcW w:w="3120" w:type="dxa"/>
+            <w:shd w:val="clear" w:color="auto" w:fill="2C3E50"/>
+            <w:tcMar>
+              <w:top w:w="80" w:type="dxa"/>
+              <w:bottom w:w="80" w:type="dxa"/>
+              <w:left w:w="120" w:type="dxa"/>
+              <w:right w:w="120" w:type="dxa"/>
+            </w:tcMar>
+          </w:tcPr>
+          <w:p>
+            <w:r>
+              <w:rPr>
+                <w:b/>
+                <w:bCs/>
+                <w:color w:val="FFFFFF"/>
+                <w:sz w:val="20"/>
+                <w:szCs w:val="20"/>
+              </w:rPr>
+              <w:t>Risk</w:t>
+            </w:r>
+          </w:p>
+        </w:tc>
+      </w:tr>
+      <w:tr>
+        <w:tc>
+          <w:tcPr>
+            <w:tcW w:w="3120" w:type="dxa"/>
+            <w:tcMar>
+              <w:top w:w="60" w:type="dxa"/>
+              <w:bottom w:w="60" w:type="dxa"/>
+              <w:left w:w="120" w:type="dxa"/>
+              <w:right w:w="120" w:type="dxa"/>
+            </w:tcMar>
+          </w:tcPr>
+          <w:p>
+            <w:r>
+              <w:rPr>
+                <w:color w:val="333333"/>
+                <w:sz w:val="20"/>
+                <w:szCs w:val="20"/>
+              </w:rPr>
+              <w:t>RC4-only accounts</w:t>
+            </w:r>
+          </w:p>
+        </w:tc>
+        <w:tc>
+          <w:tcPr>
+            <w:tcW w:w="3120" w:type="dxa"/>
+            <w:tcMar>
+              <w:top w:w="60" w:type="dxa"/>
+              <w:bottom w:w="60" w:type="dxa"/>
+              <w:left w:w="120" w:type="dxa"/>
+              <w:right w:w="120" w:type="dxa"/>
+            </w:tcMar>
+          </w:tcPr>
+          <w:p>
+            <w:r>
+              <w:rPr>
+                <w:color w:val="333333"/>
+                <w:sz w:val="20"/>
+                <w:szCs w:val="20"/>
+              </w:rPr>
+              <w:t>enc=0 or RC4 set without AES</w:t>
+            </w:r>
+          </w:p>
+        </w:tc>
+        <w:tc>
+          <w:tcPr>
+            <w:tcW w:w="3120" w:type="dxa"/>
+            <w:tcMar>
+              <w:top w:w="60" w:type="dxa"/>
+              <w:bottom w:w="60" w:type="dxa"/>
+              <w:left w:w="120" w:type="dxa"/>
+              <w:right w:w="120" w:type="dxa"/>
+            </w:tcMar>
+          </w:tcPr>
+          <w:p>
+            <w:r>
+              <w:rPr>
+                <w:color w:val="333333"/>
+                <w:sz w:val="20"/>
+                <w:szCs w:val="20"/>
+              </w:rPr>
+              <w:t>HIGH</w:t>
+            </w:r>
+          </w:p>
+        </w:tc>
+      </w:tr>
+      <w:tr>
+        <w:tc>
+          <w:tcPr>
+            <w:tcW w:w="3120" w:type="dxa"/>
+            <w:tcMar>
+              <w:top w:w="60" w:type="dxa"/>
+              <w:bottom w:w="60" w:type="dxa"/>
+              <w:left w:w="120" w:type="dxa"/>
+              <w:right w:w="120" w:type="dxa"/>
+            </w:tcMar>
+          </w:tcPr>
+          <w:p>
+            <w:r>
+              <w:rPr>
+                <w:color w:val="333333"/>
+                <w:sz w:val="20"/>
+                <w:szCs w:val="20"/>
+              </w:rPr>
+              <w:t>DES accounts</w:t>
+            </w:r>
+          </w:p>
+        </w:tc>
+        <w:tc>
+          <w:tcPr>
+            <w:tcW w:w="3120" w:type="dxa"/>
+            <w:tcMar>
+              <w:top w:w="60" w:type="dxa"/>
+              <w:bottom w:w="60" w:type="dxa"/>
+              <w:left w:w="120" w:type="dxa"/>
+              <w:right w:w="120" w:type="dxa"/>
+            </w:tcMar>
+          </w:tcPr>
+          <w:p>
+            <w:r>
+              <w:rPr>
+                <w:color w:val="333333"/>
+                <w:sz w:val="20"/>
+                <w:szCs w:val="20"/>
+              </w:rPr>
+              <w:t>DES-CBC-CRC or DES-CBC-MD5 enabled</w:t>
+            </w:r>
+          </w:p>
+        </w:tc>
+        <w:tc>
+          <w:tcPr>
+            <w:tcW w:w="3120" w:type="dxa"/>
+            <w:tcMar>
+              <w:top w:w="60" w:type="dxa"/>
+              <w:bottom w:w="60" w:type="dxa"/>
+              <w:left w:w="120" w:type="dxa"/>
+              <w:right w:w="120" w:type="dxa"/>
+            </w:tcMar>
+          </w:tcPr>
+          <w:p>
+            <w:r>
+              <w:rPr>
+                <w:color w:val="333333"/>
+                <w:sz w:val="20"/>
+                <w:szCs w:val="20"/>
+              </w:rPr>
+              <w:t>CRITICAL</w:t>
+            </w:r>
+          </w:p>
+        </w:tc>
+      </w:tr>
+      <w:tr>
+        <w:tc>
+          <w:tcPr>
+            <w:tcW w:w="3120" w:type="dxa"/>
+            <w:tcMar>
+              <w:top w:w="60" w:type="dxa"/>
+              <w:bottom w:w="60" w:type="dxa"/>
+              <w:left w:w="120" w:type="dxa"/>
+              <w:right w:w="120" w:type="dxa"/>
+            </w:tcMar>
+          </w:tcPr>
+          <w:p>
+            <w:r>
+              <w:rPr>
+                <w:color w:val="333333"/>
+                <w:sz w:val="20"/>
+                <w:szCs w:val="20"/>
+              </w:rPr>
+              <w:t>Weak DCs</w:t>
+            </w:r>
+          </w:p>
+        </w:tc>
+        <w:tc>
+          <w:tcPr>
+            <w:tcW w:w="3120" w:type="dxa"/>
+            <w:tcMar>
+              <w:top w:w="60" w:type="dxa"/>
+              <w:bottom w:w="60" w:type="dxa"/>
+              <w:left w:w="120" w:type="dxa"/>
+              <w:right w:w="120" w:type="dxa"/>
+            </w:tcMar>
+          </w:tcPr>
+          <w:p>
+            <w:r>
+              <w:rPr>
+                <w:color w:val="333333"/>
+                <w:sz w:val="20"/>
+                <w:szCs w:val="20"/>
+              </w:rPr>
+              <w:t>DC supports RC4 or has no explicit AES</w:t>
+            </w:r>
+          </w:p>
+        </w:tc>
+        <w:tc>
+          <w:tcPr>
+            <w:tcW w:w="3120" w:type="dxa"/>
+            <w:tcMar>
+              <w:top w:w="60" w:type="dxa"/>
+              <w:bottom w:w="60" w:type="dxa"/>
+              <w:left w:w="120" w:type="dxa"/>
+              <w:right w:w="120" w:type="dxa"/>
+            </w:tcMar>
+          </w:tcPr>
+          <w:p>
+            <w:r>
+              <w:rPr>
+                <w:color w:val="333333"/>
+                <w:sz w:val="20"/>
+                <w:szCs w:val="20"/>
+              </w:rPr>
+              <w:t>HIGH</w:t>
+            </w:r>
+          </w:p>
+        </w:tc>
+      </w:tr>
+    </w:tbl>
+    <w:p>
+      <w:pPr>
+        <w:spacing w:before="60" w:after="60"/>
+      </w:pPr>
+      <w:r>
+        <w:t xml:space="preserve"> </w:t>
+      </w:r>
+    </w:p>
+    <w:p>
+      <w:pPr>
+        <w:spacing w:before="60" w:after="80"/>
+      </w:pPr>
+      <w:r>
+        <w:rPr>
+          <w:color w:val="333333"/>
+        </w:rPr>
+        <w:t>All findings feed into the priority scorer — weak DCs score 65 (HIGH), DES accounts score 60 (HIGH).</w:t>
+      </w:r>
+    </w:p>
+    <w:p>
+      <w:pPr>
+        <w:spacing w:before="60" w:after="60"/>
+      </w:pPr>
+      <w:r>
+        <w:t xml:space="preserve"> </w:t>
+      </w:r>
+    </w:p>
+    <w:p>
+      <w:pPr>
+        <w:pStyle w:val="Heading2"/>
+        <w:pBdr>
+          <w:bottom w:val="single" w:sz="4" w:space="2" w:color="2471A3"/>
+        </w:pBdr>
+      </w:pPr>
+      <w:bookmarkStart w:id="101" w:name="_Toc224561351"/>
+      <w:r>
+        <w:t>4.6  Trust Mapper  (--trusts)</w:t>
+      </w:r>
+      <w:bookmarkEnd w:id="101"/>
+    </w:p>
+    <w:p>
+      <w:pPr>
+        <w:spacing w:before="60" w:after="80"/>
+      </w:pPr>
+      <w:r>
+        <w:rPr>
+          <w:color w:val="333333"/>
+        </w:rPr>
+        <w:t>Enumerates all domain trusts and assesses their risk based on direction, type, SID filtering status, and encryption.</w:t>
+      </w:r>
+    </w:p>
+    <w:p>
+      <w:pPr>
+        <w:spacing w:before="60" w:after="60"/>
+      </w:pPr>
+      <w:r>
+        <w:t xml:space="preserve"> </w:t>
+      </w:r>
+    </w:p>
+    <w:p>
+      <w:pPr>
+        <w:spacing w:before="60" w:after="80"/>
+      </w:pPr>
+      <w:r>
+        <w:rPr>
+          <w:color w:val="333333"/>
+        </w:rPr>
+        <w:t>LDAP filter: (objectClass=trustedDomain)</w:t>
+      </w:r>
+    </w:p>
+    <w:p>
+      <w:pPr>
+        <w:spacing w:before="60" w:after="80"/>
+      </w:pPr>
+      <w:r>
+        <w:rPr>
+          <w:color w:val="333333"/>
+        </w:rPr>
+        <w:t>Attributes: name, trustDirection, trustType, trustAttributes, securityIdentifier</w:t>
+      </w:r>
+    </w:p>
+    <w:p>
+      <w:pPr>
+        <w:spacing w:before="60" w:after="60"/>
+      </w:pPr>
+      <w:r>
+        <w:t xml:space="preserve"> </w:t>
+      </w:r>
+    </w:p>
+    <w:p>
+      <w:pPr>
+        <w:pStyle w:val="Heading3"/>
+      </w:pPr>
+      <w:r>
+        <w:t>Risk Assessment</w:t>
+      </w:r>
+    </w:p>
+    <w:p>
+      <w:pPr>
+        <w:spacing w:before="60" w:after="60"/>
+      </w:pPr>
+      <w:r>
+        <w:t xml:space="preserve"> </w:t>
+      </w:r>
+    </w:p>
+    <w:tbl>
+      <w:tblPr>
+        <w:tblW w:w="9360" w:type="dxa"/>
+        <w:tblBorders>
+          <w:top w:val="single" w:sz="4" w:space="0" w:color="auto"/>
+          <w:left w:val="single" w:sz="4" w:space="0" w:color="auto"/>
+          <w:bottom w:val="single" w:sz="4" w:space="0" w:color="auto"/>
+          <w:right w:val="single" w:sz="4" w:space="0" w:color="auto"/>
+          <w:insideH w:val="single" w:sz="4" w:space="0" w:color="auto"/>
+          <w:insideV w:val="single" w:sz="4" w:space="0" w:color="auto"/>
+        </w:tblBorders>
+        <w:tblCellMar>
+          <w:left w:w="10" w:type="dxa"/>
+          <w:right w:w="10" w:type="dxa"/>
+        </w:tblCellMar>
+        <w:tblLook w:val="0000" w:firstRow="0" w:lastRow="0" w:firstColumn="0" w:lastColumn="0" w:noHBand="0" w:noVBand="0"/>
+      </w:tblPr>
+      <w:tblGrid>
+        <w:gridCol w:w="3120"/>
+        <w:gridCol w:w="1560"/>
+        <w:gridCol w:w="4680"/>
+      </w:tblGrid>
+      <w:tr>
+        <w:tc>
+          <w:tcPr>
+            <w:tcW w:w="3120" w:type="dxa"/>
+            <w:shd w:val="clear" w:color="auto" w:fill="2C3E50"/>
+            <w:tcMar>
+              <w:top w:w="80" w:type="dxa"/>
+              <w:bottom w:w="80" w:type="dxa"/>
+              <w:left w:w="120" w:type="dxa"/>
+              <w:right w:w="120" w:type="dxa"/>
+            </w:tcMar>
+          </w:tcPr>
+          <w:p>
+            <w:r>
+              <w:rPr>
+                <w:b/>
+                <w:bCs/>
+                <w:color w:val="FFFFFF"/>
+                <w:sz w:val="20"/>
+                <w:szCs w:val="20"/>
+              </w:rPr>
+              <w:t>Configuration</w:t>
+            </w:r>
+          </w:p>
+        </w:tc>
+        <w:tc>
+          <w:tcPr>
+            <w:tcW w:w="1560" w:type="dxa"/>
+            <w:shd w:val="clear" w:color="auto" w:fill="2C3E50"/>
+            <w:tcMar>
+              <w:top w:w="80" w:type="dxa"/>
+              <w:bottom w:w="80" w:type="dxa"/>
+              <w:left w:w="120" w:type="dxa"/>
+              <w:right w:w="120" w:type="dxa"/>
+            </w:tcMar>
+          </w:tcPr>
+          <w:p>
+            <w:r>
+              <w:rPr>
+                <w:b/>
+                <w:bCs/>
+                <w:color w:val="FFFFFF"/>
+                <w:sz w:val="20"/>
+                <w:szCs w:val="20"/>
+              </w:rPr>
+              <w:t>Risk</w:t>
+            </w:r>
+          </w:p>
+        </w:tc>
+        <w:tc>
+          <w:tcPr>
+            <w:tcW w:w="4680" w:type="dxa"/>
+            <w:shd w:val="clear" w:color="auto" w:fill="2C3E50"/>
+            <w:tcMar>
+              <w:top w:w="80" w:type="dxa"/>
+              <w:bottom w:w="80" w:type="dxa"/>
+              <w:left w:w="120" w:type="dxa"/>
+              <w:right w:w="120" w:type="dxa"/>
+            </w:tcMar>
+          </w:tcPr>
+          <w:p>
+            <w:r>
+              <w:rPr>
+                <w:b/>
+                <w:bCs/>
+                <w:color w:val="FFFFFF"/>
+                <w:sz w:val="20"/>
+                <w:szCs w:val="20"/>
+              </w:rPr>
+              <w:t>Why</w:t>
+            </w:r>
+          </w:p>
+        </w:tc>
+      </w:tr>
+      <w:tr>
+        <w:tc>
+          <w:tcPr>
+            <w:tcW w:w="3120" w:type="dxa"/>
+            <w:tcMar>
+              <w:top w:w="60" w:type="dxa"/>
+              <w:bottom w:w="60" w:type="dxa"/>
+              <w:left w:w="120" w:type="dxa"/>
+              <w:right w:w="120" w:type="dxa"/>
+            </w:tcMar>
+          </w:tcPr>
+          <w:p>
+            <w:r>
+              <w:rPr>
+                <w:color w:val="333333"/>
+                <w:sz w:val="20"/>
+                <w:szCs w:val="20"/>
+              </w:rPr>
+              <w:t>Forest trust + SID filtering OFF</w:t>
+            </w:r>
+          </w:p>
+        </w:tc>
+        <w:tc>
+          <w:tcPr>
+            <w:tcW w:w="1560" w:type="dxa"/>
+            <w:tcMar>
+              <w:top w:w="60" w:type="dxa"/>
+              <w:bottom w:w="60" w:type="dxa"/>
+              <w:left w:w="120" w:type="dxa"/>
+              <w:right w:w="120" w:type="dxa"/>
+            </w:tcMar>
+          </w:tcPr>
+          <w:p>
+            <w:r>
+              <w:rPr>
+                <w:color w:val="333333"/>
+                <w:sz w:val="20"/>
+                <w:szCs w:val="20"/>
+              </w:rPr>
+              <w:t>CRITICAL</w:t>
+            </w:r>
+          </w:p>
+        </w:tc>
+        <w:tc>
+          <w:tcPr>
+            <w:tcW w:w="4680" w:type="dxa"/>
+            <w:tcMar>
+              <w:top w:w="60" w:type="dxa"/>
+              <w:bottom w:w="60" w:type="dxa"/>
+              <w:left w:w="120" w:type="dxa"/>
+              <w:right w:w="120" w:type="dxa"/>
+            </w:tcMar>
+          </w:tcPr>
+          <w:p>
+            <w:r>
+              <w:rPr>
+                <w:color w:val="333333"/>
+                <w:sz w:val="20"/>
+                <w:szCs w:val="20"/>
+              </w:rPr>
+              <w:t>SID history injection across forest boundary</w:t>
+            </w:r>
+          </w:p>
+        </w:tc>
+      </w:tr>
+      <w:tr>
+        <w:tc>
+          <w:tcPr>
+            <w:tcW w:w="3120" w:type="dxa"/>
+            <w:tcMar>
+              <w:top w:w="60" w:type="dxa"/>
+              <w:bottom w:w="60" w:type="dxa"/>
+              <w:left w:w="120" w:type="dxa"/>
+              <w:right w:w="120" w:type="dxa"/>
+            </w:tcMar>
+          </w:tcPr>
+          <w:p>
+            <w:r>
+              <w:rPr>
+                <w:color w:val="333333"/>
+                <w:sz w:val="20"/>
+                <w:szCs w:val="20"/>
+              </w:rPr>
+              <w:t>Bidirectional + no SID filtering</w:t>
+            </w:r>
+          </w:p>
+        </w:tc>
+        <w:tc>
+          <w:tcPr>
+            <w:tcW w:w="1560" w:type="dxa"/>
+            <w:tcMar>
+              <w:top w:w="60" w:type="dxa"/>
+              <w:bottom w:w="60" w:type="dxa"/>
+              <w:left w:w="120" w:type="dxa"/>
+              <w:right w:w="120" w:type="dxa"/>
+            </w:tcMar>
+          </w:tcPr>
+          <w:p>
+            <w:r>
+              <w:rPr>
+                <w:color w:val="333333"/>
+                <w:sz w:val="20"/>
+                <w:szCs w:val="20"/>
+              </w:rPr>
+              <w:t>HIGH</w:t>
+            </w:r>
+          </w:p>
+        </w:tc>
+        <w:tc>
+          <w:tcPr>
+            <w:tcW w:w="4680" w:type="dxa"/>
+            <w:tcMar>
+              <w:top w:w="60" w:type="dxa"/>
+              <w:bottom w:w="60" w:type="dxa"/>
+              <w:left w:w="120" w:type="dxa"/>
+              <w:right w:w="120" w:type="dxa"/>
+            </w:tcMar>
+          </w:tcPr>
+          <w:p>
+            <w:r>
+              <w:rPr>
+                <w:color w:val="333333"/>
+                <w:sz w:val="20"/>
+                <w:szCs w:val="20"/>
+              </w:rPr>
+              <w:t>Pivot path with SID history abuse</w:t>
+            </w:r>
+          </w:p>
+        </w:tc>
+      </w:tr>
+      <w:tr>
+        <w:tc>
+          <w:tcPr>
+            <w:tcW w:w="3120" w:type="dxa"/>
+            <w:tcMar>
+              <w:top w:w="60" w:type="dxa"/>
+              <w:bottom w:w="60" w:type="dxa"/>
+              <w:left w:w="120" w:type="dxa"/>
+              <w:right w:w="120" w:type="dxa"/>
+            </w:tcMar>
+          </w:tcPr>
+          <w:p>
+            <w:r>
+              <w:rPr>
+                <w:color w:val="333333"/>
+                <w:sz w:val="20"/>
+                <w:szCs w:val="20"/>
+              </w:rPr>
+              <w:t>Bidirectional trust</w:t>
+            </w:r>
+          </w:p>
+        </w:tc>
+        <w:tc>
+          <w:tcPr>
+            <w:tcW w:w="1560" w:type="dxa"/>
+            <w:tcMar>
+              <w:top w:w="60" w:type="dxa"/>
+              <w:bottom w:w="60" w:type="dxa"/>
+              <w:left w:w="120" w:type="dxa"/>
+              <w:right w:w="120" w:type="dxa"/>
+            </w:tcMar>
+          </w:tcPr>
+          <w:p>
+            <w:r>
+              <w:rPr>
+                <w:color w:val="333333"/>
+                <w:sz w:val="20"/>
+                <w:szCs w:val="20"/>
+              </w:rPr>
+              <w:t>MEDIUM</w:t>
+            </w:r>
+          </w:p>
+        </w:tc>
+        <w:tc>
+          <w:tcPr>
+            <w:tcW w:w="4680" w:type="dxa"/>
+            <w:tcMar>
+              <w:top w:w="60" w:type="dxa"/>
+              <w:bottom w:w="60" w:type="dxa"/>
+              <w:left w:w="120" w:type="dxa"/>
+              <w:right w:w="120" w:type="dxa"/>
+            </w:tcMar>
+          </w:tcPr>
+          <w:p>
+            <w:r>
+              <w:rPr>
+                <w:color w:val="333333"/>
+                <w:sz w:val="20"/>
+                <w:szCs w:val="20"/>
+              </w:rPr>
+              <w:t>Pivot possible if partner domain compromised</w:t>
+            </w:r>
+          </w:p>
+        </w:tc>
+      </w:tr>
+      <w:tr>
+        <w:tc>
+          <w:tcPr>
+            <w:tcW w:w="3120" w:type="dxa"/>
+            <w:tcMar>
+              <w:top w:w="60" w:type="dxa"/>
+              <w:bottom w:w="60" w:type="dxa"/>
+              <w:left w:w="120" w:type="dxa"/>
+              <w:right w:w="120" w:type="dxa"/>
+            </w:tcMar>
+          </w:tcPr>
+          <w:p>
+            <w:r>
+              <w:rPr>
+                <w:color w:val="333333"/>
+                <w:sz w:val="20"/>
+                <w:szCs w:val="20"/>
+              </w:rPr>
+              <w:t>RC4 encryption on trust</w:t>
+            </w:r>
+          </w:p>
+        </w:tc>
+        <w:tc>
+          <w:tcPr>
+            <w:tcW w:w="1560" w:type="dxa"/>
+            <w:tcMar>
+              <w:top w:w="60" w:type="dxa"/>
+              <w:bottom w:w="60" w:type="dxa"/>
+              <w:left w:w="120" w:type="dxa"/>
+              <w:right w:w="120" w:type="dxa"/>
+            </w:tcMar>
+          </w:tcPr>
+          <w:p>
+            <w:r>
+              <w:rPr>
+                <w:color w:val="333333"/>
+                <w:sz w:val="20"/>
+                <w:szCs w:val="20"/>
+              </w:rPr>
+              <w:t>LOW</w:t>
+            </w:r>
+          </w:p>
+        </w:tc>
+        <w:tc>
+          <w:tcPr>
+            <w:tcW w:w="4680" w:type="dxa"/>
+            <w:tcMar>
+              <w:top w:w="60" w:type="dxa"/>
+              <w:bottom w:w="60" w:type="dxa"/>
+              <w:left w:w="120" w:type="dxa"/>
+              <w:right w:w="120" w:type="dxa"/>
+            </w:tcMar>
+          </w:tcPr>
+          <w:p>
+            <w:r>
+              <w:rPr>
+                <w:color w:val="333333"/>
+                <w:sz w:val="20"/>
+                <w:szCs w:val="20"/>
+              </w:rPr>
+              <w:t>Weak encryption</w:t>
+            </w:r>
+          </w:p>
+        </w:tc>
+      </w:tr>
+    </w:tbl>
+    <w:p>
+      <w:pPr>
+        <w:spacing w:before="60" w:after="60"/>
+      </w:pPr>
+      <w:r>
+        <w:t xml:space="preserve"> </w:t>
+      </w:r>
+    </w:p>
+    <w:p>
+      <w:pPr>
+        <w:spacing w:before="60" w:after="80"/>
+      </w:pPr>
+      <w:r>
+        <w:rPr>
+          <w:color w:val="333333"/>
+        </w:rPr>
+        <w:t>Output is a Rich table showing trust partner, direction, type, SID filtering status, and risk level.</w:t>
+      </w:r>
+    </w:p>
+    <w:p>
+      <w:r>
+        <w:br w:type="page"/>
+      </w:r>
+    </w:p>
+    <w:p>
+      <w:pPr>
+        <w:sectPr>
+          <w:pgSz w:w="12240" w:h="15840"/>
+          <w:pgMar w:top="1440" w:right="1440" w:bottom="1440" w:left="1440" w:header="708" w:footer="708" w:gutter="0"/>
+          <w:cols w:space="720"/>
+          <w:docGrid w:linePitch="360"/>
+        </w:sectPr>
+      </w:pPr>
+    </w:p>
+    <w:p>
+      <w:pPr>
         <w:pStyle w:val="Heading1"/>
       </w:pPr>
       <w:bookmarkStart w:id="28" w:name="_Toc224561308"/>
@@ -10828,6 +10335,499 @@
         <w:t xml:space="preserve"> </w:t>
       </w:r>
     </w:p>
+    <w:p>
+      <w:r>
+        <w:br w:type="page"/>
+      </w:r>
+    </w:p>
+    <w:p>
+      <w:pPr>
+        <w:spacing w:before="60" w:after="60"/>
+      </w:pPr>
+      <w:r>
+        <w:t xml:space="preserve"> </w:t>
+      </w:r>
+    </w:p>
+    <w:p>
+      <w:pPr>
+        <w:pStyle w:val="Heading2"/>
+        <w:pBdr>
+          <w:bottom w:val="single" w:sz="4" w:space="2" w:color="2471A3"/>
+        </w:pBdr>
+      </w:pPr>
+      <w:bookmarkStart w:id="110" w:name="_Toc224561360"/>
+      <w:r>
+        <w:t>5.7  GPP Passwords — MS14-025</w:t>
+      </w:r>
+      <w:bookmarkEnd w:id="110"/>
+    </w:p>
+    <w:p>
+      <w:pPr>
+        <w:spacing w:before="60" w:after="80"/>
+      </w:pPr>
+      <w:r>
+        <w:rPr>
+          <w:color w:val="333333"/>
+        </w:rPr>
+        <w:t>Group Policy Preferences created before KB2962486 may store passwords encrypted with a publicly known AES key. Any domain user can read SYSVOL and decrypt these passwords.</w:t>
+      </w:r>
+    </w:p>
+    <w:p>
+      <w:pPr>
+        <w:spacing w:before="60" w:after="60"/>
+      </w:pPr>
+      <w:r>
+        <w:t xml:space="preserve"> </w:t>
+      </w:r>
+    </w:p>
+    <w:p>
+      <w:pPr>
+        <w:spacing w:before="60" w:after="80"/>
+      </w:pPr>
+      <w:r>
+        <w:rPr>
+          <w:color w:val="333333"/>
+        </w:rPr>
+        <w:t>Detection: Queries all groupPolicyContainer objects via LDAP and checks gPCFileSysPath attributes for SYSVOL paths containing potential cpassword XML files (Groups.xml, ScheduledTasks.xml, Services.xml, DataSources.xml).</w:t>
+      </w:r>
+    </w:p>
+    <w:p>
+      <w:pPr>
+        <w:spacing w:before="60" w:after="60"/>
+      </w:pPr>
+      <w:r>
+        <w:t xml:space="preserve"> </w:t>
+      </w:r>
+    </w:p>
+    <w:p>
+      <w:pPr>
+        <w:spacing w:before="60" w:after="80"/>
+      </w:pPr>
+      <w:r>
+        <w:rPr>
+          <w:color w:val="333333"/>
+        </w:rPr>
+        <w:t>Remediation: Apply KB2962486, delete existing GPP XML files containing cpassword, reset affected passwords.</w:t>
+      </w:r>
+    </w:p>
+    <w:p>
+      <w:pPr>
+        <w:spacing w:before="60" w:after="60"/>
+      </w:pPr>
+      <w:r>
+        <w:t xml:space="preserve"> </w:t>
+      </w:r>
+    </w:p>
+    <w:tbl>
+      <w:tblPr>
+        <w:tblW w:w="9360" w:type="dxa"/>
+        <w:tblBorders>
+          <w:top w:val="none" w:sz="0" w:space="0" w:color="auto"/>
+          <w:left w:val="none" w:sz="0" w:space="0" w:color="auto"/>
+          <w:bottom w:val="none" w:sz="0" w:space="0" w:color="auto"/>
+          <w:right w:val="none" w:sz="0" w:space="0" w:color="auto"/>
+        </w:tblBorders>
+        <w:tblCellMar>
+          <w:left w:w="10" w:type="dxa"/>
+          <w:right w:w="10" w:type="dxa"/>
+        </w:tblCellMar>
+        <w:tblLook w:val="0000" w:firstRow="0" w:lastRow="0" w:firstColumn="0" w:lastColumn="0" w:noHBand="0" w:noVBand="0"/>
+      </w:tblPr>
+      <w:tblGrid>
+        <w:gridCol w:w="9360"/>
+      </w:tblGrid>
+      <w:tr>
+        <w:tc>
+          <w:tcPr>
+            <w:tcW w:w="9360" w:type="dxa"/>
+            <w:shd w:val="clear" w:color="auto" w:fill="2C3E50"/>
+            <w:tcMar>
+              <w:top w:w="120" w:type="dxa"/>
+              <w:bottom w:w="120" w:type="dxa"/>
+              <w:left w:w="200" w:type="dxa"/>
+              <w:right w:w="200" w:type="dxa"/>
+            </w:tcMar>
+          </w:tcPr>
+          <w:p>
+            <w:r>
+              <w:rPr>
+                <w:rFonts w:ascii="Courier New" w:eastAsia="Courier New" w:hAnsi="Courier New" w:cs="Courier New"/>
+                <w:color w:val="A8D8EA"/>
+                <w:sz w:val="18"/>
+                <w:szCs w:val="18"/>
+              </w:rPr>
+              <w:t>Get-GPPPassword.py domain/user:pass@DC_IP</w:t>
+            </w:r>
+          </w:p>
+        </w:tc>
+      </w:tr>
+    </w:tbl>
+    <w:p>
+      <w:pPr>
+        <w:spacing w:before="60" w:after="60"/>
+      </w:pPr>
+      <w:r>
+        <w:t xml:space="preserve"> </w:t>
+      </w:r>
+    </w:p>
+    <w:p>
+      <w:pPr>
+        <w:pStyle w:val="Heading2"/>
+        <w:pBdr>
+          <w:bottom w:val="single" w:sz="4" w:space="2" w:color="2471A3"/>
+        </w:pBdr>
+      </w:pPr>
+      <w:bookmarkStart w:id="111" w:name="_Toc224561361"/>
+      <w:r>
+        <w:t>5.8  Bronze Bit — CVE-2020-17049</w:t>
+      </w:r>
+      <w:bookmarkEnd w:id="111"/>
+    </w:p>
+    <w:p>
+      <w:pPr>
+        <w:spacing w:before="60" w:after="80"/>
+      </w:pPr>
+      <w:r>
+        <w:rPr>
+          <w:color w:val="333333"/>
+        </w:rPr>
+        <w:t>Bypasses the S4U2Self forwardable flag validation in constrained delegation. An attacker with a constrained delegation account can impersonate any user to any service in the delegation list, even without protocol transition enabled.</w:t>
+      </w:r>
+    </w:p>
+    <w:p>
+      <w:pPr>
+        <w:spacing w:before="60" w:after="60"/>
+      </w:pPr>
+      <w:r>
+        <w:t xml:space="preserve"> </w:t>
+      </w:r>
+    </w:p>
+    <w:p>
+      <w:pPr>
+        <w:spacing w:before="60" w:after="80"/>
+      </w:pPr>
+      <w:r>
+        <w:rPr>
+          <w:color w:val="333333"/>
+        </w:rPr>
+        <w:t>Detection: Checks if constrained delegation accounts exist AND the domain functional level suggests the patch (KB4598347) has not been applied (DFL &lt; 7).</w:t>
+      </w:r>
+    </w:p>
+    <w:p>
+      <w:pPr>
+        <w:spacing w:before="60" w:after="60"/>
+      </w:pPr>
+      <w:r>
+        <w:t xml:space="preserve"> </w:t>
+      </w:r>
+    </w:p>
+    <w:p>
+      <w:pPr>
+        <w:spacing w:before="60" w:after="80"/>
+      </w:pPr>
+      <w:r>
+        <w:rPr>
+          <w:color w:val="333333"/>
+        </w:rPr>
+        <w:t>Remediation: Apply KB4598347 on all DCs, set PerformTicketSignature=2 registry key.</w:t>
+      </w:r>
+    </w:p>
+    <w:p>
+      <w:pPr>
+        <w:spacing w:before="60" w:after="60"/>
+      </w:pPr>
+      <w:r>
+        <w:t xml:space="preserve"> </w:t>
+      </w:r>
+    </w:p>
+    <w:tbl>
+      <w:tblPr>
+        <w:tblW w:w="9360" w:type="dxa"/>
+        <w:tblBorders>
+          <w:top w:val="none" w:sz="0" w:space="0" w:color="auto"/>
+          <w:left w:val="none" w:sz="0" w:space="0" w:color="auto"/>
+          <w:bottom w:val="none" w:sz="0" w:space="0" w:color="auto"/>
+          <w:right w:val="none" w:sz="0" w:space="0" w:color="auto"/>
+        </w:tblBorders>
+        <w:tblCellMar>
+          <w:left w:w="10" w:type="dxa"/>
+          <w:right w:w="10" w:type="dxa"/>
+        </w:tblCellMar>
+        <w:tblLook w:val="0000" w:firstRow="0" w:lastRow="0" w:firstColumn="0" w:lastColumn="0" w:noHBand="0" w:noVBand="0"/>
+      </w:tblPr>
+      <w:tblGrid>
+        <w:gridCol w:w="9360"/>
+      </w:tblGrid>
+      <w:tr>
+        <w:tc>
+          <w:tcPr>
+            <w:tcW w:w="9360" w:type="dxa"/>
+            <w:shd w:val="clear" w:color="auto" w:fill="2C3E50"/>
+            <w:tcMar>
+              <w:top w:w="120" w:type="dxa"/>
+              <w:bottom w:w="120" w:type="dxa"/>
+              <w:left w:w="200" w:type="dxa"/>
+              <w:right w:w="200" w:type="dxa"/>
+            </w:tcMar>
+          </w:tcPr>
+          <w:p>
+            <w:r>
+              <w:rPr>
+                <w:rFonts w:ascii="Courier New" w:eastAsia="Courier New" w:hAnsi="Courier New" w:cs="Courier New"/>
+                <w:color w:val="A8D8EA"/>
+                <w:sz w:val="18"/>
+                <w:szCs w:val="18"/>
+              </w:rPr>
+              <w:t>getST.py -spn TARGET_SPN -impersonate Administrator -force-forwardable -dc-ip DC_IP domain/user:pass</w:t>
+            </w:r>
+          </w:p>
+        </w:tc>
+      </w:tr>
+    </w:tbl>
+    <w:p>
+      <w:pPr>
+        <w:spacing w:before="60" w:after="60"/>
+      </w:pPr>
+      <w:r>
+        <w:t xml:space="preserve"> </w:t>
+      </w:r>
+    </w:p>
+    <w:p>
+      <w:pPr>
+        <w:pStyle w:val="Heading2"/>
+        <w:pBdr>
+          <w:bottom w:val="single" w:sz="4" w:space="2" w:color="2471A3"/>
+        </w:pBdr>
+      </w:pPr>
+      <w:bookmarkStart w:id="112" w:name="_Toc224561362"/>
+      <w:r>
+        <w:t>5.9  Certifried — CVE-2022-26923</w:t>
+      </w:r>
+      <w:bookmarkEnd w:id="112"/>
+    </w:p>
+    <w:p>
+      <w:pPr>
+        <w:spacing w:before="60" w:after="80"/>
+      </w:pPr>
+      <w:r>
+        <w:rPr>
+          <w:color w:val="333333"/>
+        </w:rPr>
+        <w:t>Any domain user can create a machine account (if MachineAccountQuota &gt; 0), set its dNSHostName to match a DC, request a certificate, and authenticate as the DC — full domain compromise. Severity: CRITICAL.</w:t>
+      </w:r>
+    </w:p>
+    <w:p>
+      <w:pPr>
+        <w:spacing w:before="60" w:after="60"/>
+      </w:pPr>
+      <w:r>
+        <w:t xml:space="preserve"> </w:t>
+      </w:r>
+    </w:p>
+    <w:p>
+      <w:pPr>
+        <w:spacing w:before="60" w:after="80"/>
+      </w:pPr>
+      <w:r>
+        <w:rPr>
+          <w:color w:val="333333"/>
+        </w:rPr>
+        <w:t>Detection: Checks three conditions via LDAP: (1) AD CS enrollment services exist, (2) ms-DS-MachineAccountQuota &gt; 0, (3) domain appears unpatched (DFL &lt; 7).</w:t>
+      </w:r>
+    </w:p>
+    <w:p>
+      <w:pPr>
+        <w:spacing w:before="60" w:after="60"/>
+      </w:pPr>
+      <w:r>
+        <w:t xml:space="preserve"> </w:t>
+      </w:r>
+    </w:p>
+    <w:p>
+      <w:pPr>
+        <w:spacing w:before="60" w:after="80"/>
+      </w:pPr>
+      <w:r>
+        <w:rPr>
+          <w:color w:val="333333"/>
+        </w:rPr>
+        <w:t>Remediation: Apply KB5014754 (May 2022 updates), set MachineAccountQuota=0, enable strong certificate mapping.</w:t>
+      </w:r>
+    </w:p>
+    <w:p>
+      <w:pPr>
+        <w:spacing w:before="60" w:after="60"/>
+      </w:pPr>
+      <w:r>
+        <w:t xml:space="preserve"> </w:t>
+      </w:r>
+    </w:p>
+    <w:tbl>
+      <w:tblPr>
+        <w:tblW w:w="9360" w:type="dxa"/>
+        <w:tblBorders>
+          <w:top w:val="none" w:sz="0" w:space="0" w:color="auto"/>
+          <w:left w:val="none" w:sz="0" w:space="0" w:color="auto"/>
+          <w:bottom w:val="none" w:sz="0" w:space="0" w:color="auto"/>
+          <w:right w:val="none" w:sz="0" w:space="0" w:color="auto"/>
+        </w:tblBorders>
+        <w:tblCellMar>
+          <w:left w:w="10" w:type="dxa"/>
+          <w:right w:w="10" w:type="dxa"/>
+        </w:tblCellMar>
+        <w:tblLook w:val="0000" w:firstRow="0" w:lastRow="0" w:firstColumn="0" w:lastColumn="0" w:noHBand="0" w:noVBand="0"/>
+      </w:tblPr>
+      <w:tblGrid>
+        <w:gridCol w:w="9360"/>
+      </w:tblGrid>
+      <w:tr>
+        <w:tc>
+          <w:tcPr>
+            <w:tcW w:w="9360" w:type="dxa"/>
+            <w:shd w:val="clear" w:color="auto" w:fill="2C3E50"/>
+            <w:tcMar>
+              <w:top w:w="120" w:type="dxa"/>
+              <w:bottom w:w="120" w:type="dxa"/>
+              <w:left w:w="200" w:type="dxa"/>
+              <w:right w:w="200" w:type="dxa"/>
+            </w:tcMar>
+          </w:tcPr>
+          <w:p>
+            <w:r>
+              <w:rPr>
+                <w:rFonts w:ascii="Courier New" w:eastAsia="Courier New" w:hAnsi="Courier New" w:cs="Courier New"/>
+                <w:color w:val="A8D8EA"/>
+                <w:sz w:val="18"/>
+                <w:szCs w:val="18"/>
+              </w:rPr>
+              <w:t>certipy account create -u user@domain -p pass -dc-ip DC_IP -user FAKE$ -dns DC_FQDN</w:t>
+            </w:r>
+          </w:p>
+        </w:tc>
+      </w:tr>
+    </w:tbl>
+    <w:p>
+      <w:pPr>
+        <w:spacing w:before="60" w:after="60"/>
+      </w:pPr>
+      <w:r>
+        <w:t xml:space="preserve"> </w:t>
+      </w:r>
+    </w:p>
+    <w:p>
+      <w:pPr>
+        <w:pStyle w:val="Heading2"/>
+        <w:pBdr>
+          <w:bottom w:val="single" w:sz="4" w:space="2" w:color="2471A3"/>
+        </w:pBdr>
+      </w:pPr>
+      <w:bookmarkStart w:id="113" w:name="_Toc224561363"/>
+      <w:r>
+        <w:t>5.10  LDAP Signing Not Required</w:t>
+      </w:r>
+      <w:bookmarkEnd w:id="113"/>
+    </w:p>
+    <w:p>
+      <w:pPr>
+        <w:spacing w:before="60" w:after="80"/>
+      </w:pPr>
+      <w:r>
+        <w:rPr>
+          <w:color w:val="333333"/>
+        </w:rPr>
+        <w:t>If LDAP signing is not enforced on the DC, NTLM relay attacks to LDAP are possible (ntlmrelayx, mitm6, Responder). This enables privilege escalation via RBCD or delegation abuse. Severity: HIGH.</w:t>
+      </w:r>
+    </w:p>
+    <w:p>
+      <w:pPr>
+        <w:spacing w:before="60" w:after="60"/>
+      </w:pPr>
+      <w:r>
+        <w:t xml:space="preserve"> </w:t>
+      </w:r>
+    </w:p>
+    <w:p>
+      <w:pPr>
+        <w:spacing w:before="60" w:after="80"/>
+      </w:pPr>
+      <w:r>
+        <w:rPr>
+          <w:color w:val="333333"/>
+        </w:rPr>
+        <w:t>Detection: Checks whether the current LDAP connection was established without signing (port 389 vs 636/LDAPS).</w:t>
+      </w:r>
+    </w:p>
+    <w:p>
+      <w:pPr>
+        <w:spacing w:before="60" w:after="60"/>
+      </w:pPr>
+      <w:r>
+        <w:t xml:space="preserve"> </w:t>
+      </w:r>
+    </w:p>
+    <w:p>
+      <w:pPr>
+        <w:spacing w:before="60" w:after="80"/>
+      </w:pPr>
+      <w:r>
+        <w:rPr>
+          <w:color w:val="333333"/>
+        </w:rPr>
+        <w:t>Remediation: Set “Domain controller: LDAP server signing requirements” to “Require signing” via GPO. Enable LDAP channel binding (LdapEnforceChannelBinding=2).</w:t>
+      </w:r>
+    </w:p>
+    <w:p>
+      <w:pPr>
+        <w:spacing w:before="60" w:after="60"/>
+      </w:pPr>
+      <w:r>
+        <w:t xml:space="preserve"> </w:t>
+      </w:r>
+    </w:p>
+    <w:tbl>
+      <w:tblPr>
+        <w:tblW w:w="9360" w:type="dxa"/>
+        <w:tblBorders>
+          <w:top w:val="none" w:sz="0" w:space="0" w:color="auto"/>
+          <w:left w:val="none" w:sz="0" w:space="0" w:color="auto"/>
+          <w:bottom w:val="none" w:sz="0" w:space="0" w:color="auto"/>
+          <w:right w:val="none" w:sz="0" w:space="0" w:color="auto"/>
+        </w:tblBorders>
+        <w:tblCellMar>
+          <w:left w:w="10" w:type="dxa"/>
+          <w:right w:w="10" w:type="dxa"/>
+        </w:tblCellMar>
+        <w:tblLook w:val="0000" w:firstRow="0" w:lastRow="0" w:firstColumn="0" w:lastColumn="0" w:noHBand="0" w:noVBand="0"/>
+      </w:tblPr>
+      <w:tblGrid>
+        <w:gridCol w:w="9360"/>
+      </w:tblGrid>
+      <w:tr>
+        <w:tc>
+          <w:tcPr>
+            <w:tcW w:w="9360" w:type="dxa"/>
+            <w:shd w:val="clear" w:color="auto" w:fill="2C3E50"/>
+            <w:tcMar>
+              <w:top w:w="120" w:type="dxa"/>
+              <w:bottom w:w="120" w:type="dxa"/>
+              <w:left w:w="200" w:type="dxa"/>
+              <w:right w:w="200" w:type="dxa"/>
+            </w:tcMar>
+          </w:tcPr>
+          <w:p>
+            <w:r>
+              <w:rPr>
+                <w:rFonts w:ascii="Courier New" w:eastAsia="Courier New" w:hAnsi="Courier New" w:cs="Courier New"/>
+                <w:color w:val="A8D8EA"/>
+                <w:sz w:val="18"/>
+                <w:szCs w:val="18"/>
+              </w:rPr>
+              <w:t>ntlmrelayx.py -t ldap://DC_IP --delegate-access</w:t>
+            </w:r>
+          </w:p>
+        </w:tc>
+      </w:tr>
+    </w:tbl>
     <w:p>
       <w:r>
         <w:br w:type="page"/>

</xml_diff>